<commit_message>
Restore push_research.sh, push_wild8highlander.sh, TERMUX_GUIDE.md, НАЧНИ_ЗДЕСЬ.md
</commit_message>
<xml_diff>
--- a/research_col_smar/monograph/MONOGRAPH_EN.docx
+++ b/research_col_smar/monograph/MONOGRAPH_EN.docx
@@ -517,9 +517,1651 @@
         <w:p>
           <w:r>
             <w:fldChar w:fldCharType="begin" w:dirty="true"/>
+          </w:r>
+          <w:r>
             <w:instrText xml:space="preserve">TOC \h \o "1-2"</w:instrText>
+          </w:r>
+          <w:r>
             <w:fldChar w:fldCharType="separate"/>
           </w:r>
+        </w:p>
+        <w:p>
+          <w:pPr>
+            <w:pStyle w:val="9"/>
+            <w:tabs>
+              <w:tab w:val="right" w:leader="dot" w:pos="9026"/>
+            </w:tabs>
+            <w:spacing w:before="120" w:after="60"/>
+          </w:pPr>
+          <w:hyperlink w:anchor="_Toc100000" w:history="1">
+            <w:r>
+              <w:rPr>
+                <w:rStyle w:val="Hyperlink"/>
+              </w:rPr>
+              <w:t>1. Introduction: two constants and one question</w:t>
+            </w:r>
+            <w:r>
+              <w:tab/>
+            </w:r>
+            <w:r>
+              <w:fldChar w:fldCharType="begin"/>
+            </w:r>
+            <w:r>
+              <w:instrText xml:space="preserve"> PAGEREF _Toc100000 \h </w:instrText>
+            </w:r>
+            <w:r>
+              <w:fldChar w:fldCharType="separate"/>
+            </w:r>
+            <w:r>
+              <w:t>1</w:t>
+            </w:r>
+            <w:r>
+              <w:fldChar w:fldCharType="end"/>
+            </w:r>
+          </w:hyperlink>
+        </w:p>
+        <w:p>
+          <w:pPr>
+            <w:pStyle w:val="9"/>
+            <w:tabs>
+              <w:tab w:val="right" w:leader="dot" w:pos="9026"/>
+            </w:tabs>
+            <w:spacing w:before="120" w:after="60"/>
+          </w:pPr>
+          <w:hyperlink w:anchor="_Toc100001" w:history="1">
+            <w:r>
+              <w:rPr>
+                <w:rStyle w:val="Hyperlink"/>
+              </w:rPr>
+              <w:t>2. Mathematical apparatus</w:t>
+            </w:r>
+            <w:r>
+              <w:tab/>
+            </w:r>
+            <w:r>
+              <w:fldChar w:fldCharType="begin"/>
+            </w:r>
+            <w:r>
+              <w:instrText xml:space="preserve"> PAGEREF _Toc100001 \h </w:instrText>
+            </w:r>
+            <w:r>
+              <w:fldChar w:fldCharType="separate"/>
+            </w:r>
+            <w:r>
+              <w:t>2</w:t>
+            </w:r>
+            <w:r>
+              <w:fldChar w:fldCharType="end"/>
+            </w:r>
+          </w:hyperlink>
+        </w:p>
+        <w:p>
+          <w:pPr>
+            <w:pStyle w:val="11"/>
+            <w:ind w:left="360"/>
+            <w:tabs>
+              <w:tab w:val="right" w:leader="dot" w:pos="9026"/>
+            </w:tabs>
+            <w:spacing w:before="120" w:after="60"/>
+          </w:pPr>
+          <w:hyperlink w:anchor="_Toc100002" w:history="1">
+            <w:r>
+              <w:rPr>
+                <w:rStyle w:val="Hyperlink"/>
+              </w:rPr>
+              <w:t>2.1. Equations and notation</w:t>
+            </w:r>
+            <w:r>
+              <w:tab/>
+            </w:r>
+            <w:r>
+              <w:fldChar w:fldCharType="begin"/>
+            </w:r>
+            <w:r>
+              <w:instrText xml:space="preserve"> PAGEREF _Toc100002 \h </w:instrText>
+            </w:r>
+            <w:r>
+              <w:fldChar w:fldCharType="separate"/>
+            </w:r>
+            <w:r>
+              <w:t>2</w:t>
+            </w:r>
+            <w:r>
+              <w:fldChar w:fldCharType="end"/>
+            </w:r>
+          </w:hyperlink>
+        </w:p>
+        <w:p>
+          <w:pPr>
+            <w:pStyle w:val="11"/>
+            <w:ind w:left="360"/>
+            <w:tabs>
+              <w:tab w:val="right" w:leader="dot" w:pos="9026"/>
+            </w:tabs>
+            <w:spacing w:before="120" w:after="60"/>
+          </w:pPr>
+          <w:hyperlink w:anchor="_Toc100003" w:history="1">
+            <w:r>
+              <w:rPr>
+                <w:rStyle w:val="Hyperlink"/>
+              </w:rPr>
+              <w:t>2.2. Filtering and the LES formalism</w:t>
+            </w:r>
+            <w:r>
+              <w:tab/>
+            </w:r>
+            <w:r>
+              <w:fldChar w:fldCharType="begin"/>
+            </w:r>
+            <w:r>
+              <w:instrText xml:space="preserve"> PAGEREF _Toc100003 \h </w:instrText>
+            </w:r>
+            <w:r>
+              <w:fldChar w:fldCharType="separate"/>
+            </w:r>
+            <w:r>
+              <w:t>3</w:t>
+            </w:r>
+            <w:r>
+              <w:fldChar w:fldCharType="end"/>
+            </w:r>
+          </w:hyperlink>
+        </w:p>
+        <w:p>
+          <w:pPr>
+            <w:pStyle w:val="11"/>
+            <w:ind w:left="360"/>
+            <w:tabs>
+              <w:tab w:val="right" w:leader="dot" w:pos="9026"/>
+            </w:tabs>
+            <w:spacing w:before="120" w:after="60"/>
+          </w:pPr>
+          <w:hyperlink w:anchor="_Toc100004" w:history="1">
+            <w:r>
+              <w:rPr>
+                <w:rStyle w:val="Hyperlink"/>
+              </w:rPr>
+              <w:t>2.3. Conventions that are usually left implicit</w:t>
+            </w:r>
+            <w:r>
+              <w:tab/>
+            </w:r>
+            <w:r>
+              <w:fldChar w:fldCharType="begin"/>
+            </w:r>
+            <w:r>
+              <w:instrText xml:space="preserve"> PAGEREF _Toc100004 \h </w:instrText>
+            </w:r>
+            <w:r>
+              <w:fldChar w:fldCharType="separate"/>
+            </w:r>
+            <w:r>
+              <w:t>4</w:t>
+            </w:r>
+            <w:r>
+              <w:fldChar w:fldCharType="end"/>
+            </w:r>
+          </w:hyperlink>
+        </w:p>
+        <w:p>
+          <w:pPr>
+            <w:pStyle w:val="9"/>
+            <w:tabs>
+              <w:tab w:val="right" w:leader="dot" w:pos="9026"/>
+            </w:tabs>
+            <w:spacing w:before="120" w:after="60"/>
+          </w:pPr>
+          <w:hyperlink w:anchor="_Toc100005" w:history="1">
+            <w:r>
+              <w:rPr>
+                <w:rStyle w:val="Hyperlink"/>
+              </w:rPr>
+              <w:t>3. K41 and what it cannot fix</w:t>
+            </w:r>
+            <w:r>
+              <w:tab/>
+            </w:r>
+            <w:r>
+              <w:fldChar w:fldCharType="begin"/>
+            </w:r>
+            <w:r>
+              <w:instrText xml:space="preserve"> PAGEREF _Toc100005 \h </w:instrText>
+            </w:r>
+            <w:r>
+              <w:fldChar w:fldCharType="separate"/>
+            </w:r>
+            <w:r>
+              <w:t>5</w:t>
+            </w:r>
+            <w:r>
+              <w:fldChar w:fldCharType="end"/>
+            </w:r>
+          </w:hyperlink>
+        </w:p>
+        <w:p>
+          <w:pPr>
+            <w:pStyle w:val="11"/>
+            <w:ind w:left="360"/>
+            <w:tabs>
+              <w:tab w:val="right" w:leader="dot" w:pos="9026"/>
+            </w:tabs>
+            <w:spacing w:before="120" w:after="60"/>
+          </w:pPr>
+          <w:hyperlink w:anchor="_Toc100006" w:history="1">
+            <w:r>
+              <w:rPr>
+                <w:rStyle w:val="Hyperlink"/>
+              </w:rPr>
+              <w:t>3.1. Kolmogorov's hypotheses and the −5/3 spectrum</w:t>
+            </w:r>
+            <w:r>
+              <w:tab/>
+            </w:r>
+            <w:r>
+              <w:fldChar w:fldCharType="begin"/>
+            </w:r>
+            <w:r>
+              <w:instrText xml:space="preserve"> PAGEREF _Toc100006 \h </w:instrText>
+            </w:r>
+            <w:r>
+              <w:fldChar w:fldCharType="separate"/>
+            </w:r>
+            <w:r>
+              <w:t>5</w:t>
+            </w:r>
+            <w:r>
+              <w:fldChar w:fldCharType="end"/>
+            </w:r>
+          </w:hyperlink>
+        </w:p>
+        <w:p>
+          <w:pPr>
+            <w:pStyle w:val="11"/>
+            <w:ind w:left="360"/>
+            <w:tabs>
+              <w:tab w:val="right" w:leader="dot" w:pos="9026"/>
+            </w:tabs>
+            <w:spacing w:before="120" w:after="60"/>
+          </w:pPr>
+          <w:hyperlink w:anchor="_Toc100007" w:history="1">
+            <w:r>
+              <w:rPr>
+                <w:rStyle w:val="Hyperlink"/>
+              </w:rPr>
+              <w:t>3.2. The status of C_K</w:t>
+            </w:r>
+            <w:r>
+              <w:tab/>
+            </w:r>
+            <w:r>
+              <w:fldChar w:fldCharType="begin"/>
+            </w:r>
+            <w:r>
+              <w:instrText xml:space="preserve"> PAGEREF _Toc100007 \h </w:instrText>
+            </w:r>
+            <w:r>
+              <w:fldChar w:fldCharType="separate"/>
+            </w:r>
+            <w:r>
+              <w:t>5</w:t>
+            </w:r>
+            <w:r>
+              <w:fldChar w:fldCharType="end"/>
+            </w:r>
+          </w:hyperlink>
+        </w:p>
+        <w:p>
+          <w:pPr>
+            <w:pStyle w:val="11"/>
+            <w:ind w:left="360"/>
+            <w:tabs>
+              <w:tab w:val="right" w:leader="dot" w:pos="9026"/>
+            </w:tabs>
+            <w:spacing w:before="120" w:after="60"/>
+          </w:pPr>
+          <w:hyperlink w:anchor="_Toc100008" w:history="1">
+            <w:r>
+              <w:rPr>
+                <w:rStyle w:val="Hyperlink"/>
+              </w:rPr>
+              <w:t>3.3. What is needed to close the system</w:t>
+            </w:r>
+            <w:r>
+              <w:tab/>
+            </w:r>
+            <w:r>
+              <w:fldChar w:fldCharType="begin"/>
+            </w:r>
+            <w:r>
+              <w:instrText xml:space="preserve"> PAGEREF _Toc100008 \h </w:instrText>
+            </w:r>
+            <w:r>
+              <w:fldChar w:fldCharType="separate"/>
+            </w:r>
+            <w:r>
+              <w:t>6</w:t>
+            </w:r>
+            <w:r>
+              <w:fldChar w:fldCharType="end"/>
+            </w:r>
+          </w:hyperlink>
+        </w:p>
+        <w:p>
+          <w:pPr>
+            <w:pStyle w:val="9"/>
+            <w:tabs>
+              <w:tab w:val="right" w:leader="dot" w:pos="9026"/>
+            </w:tabs>
+            <w:spacing w:before="120" w:after="60"/>
+          </w:pPr>
+          <w:hyperlink w:anchor="_Toc100009" w:history="1">
+            <w:r>
+              <w:rPr>
+                <w:rStyle w:val="Hyperlink"/>
+              </w:rPr>
+              <w:t>4. Derivation I: the master relation C_s(C_K)</w:t>
+            </w:r>
+            <w:r>
+              <w:tab/>
+            </w:r>
+            <w:r>
+              <w:fldChar w:fldCharType="begin"/>
+            </w:r>
+            <w:r>
+              <w:instrText xml:space="preserve"> PAGEREF _Toc100009 \h </w:instrText>
+            </w:r>
+            <w:r>
+              <w:fldChar w:fldCharType="separate"/>
+            </w:r>
+            <w:r>
+              <w:t>6</w:t>
+            </w:r>
+            <w:r>
+              <w:fldChar w:fldCharType="end"/>
+            </w:r>
+          </w:hyperlink>
+        </w:p>
+        <w:p>
+          <w:pPr>
+            <w:pStyle w:val="11"/>
+            <w:ind w:left="360"/>
+            <w:tabs>
+              <w:tab w:val="right" w:leader="dot" w:pos="9026"/>
+            </w:tabs>
+            <w:spacing w:before="120" w:after="60"/>
+          </w:pPr>
+          <w:hyperlink w:anchor="_Toc100010" w:history="1">
+            <w:r>
+              <w:rPr>
+                <w:rStyle w:val="Hyperlink"/>
+              </w:rPr>
+              <w:t>4.1. The subgrid budget</w:t>
+            </w:r>
+            <w:r>
+              <w:tab/>
+            </w:r>
+            <w:r>
+              <w:fldChar w:fldCharType="begin"/>
+            </w:r>
+            <w:r>
+              <w:instrText xml:space="preserve"> PAGEREF _Toc100010 \h </w:instrText>
+            </w:r>
+            <w:r>
+              <w:fldChar w:fldCharType="separate"/>
+            </w:r>
+            <w:r>
+              <w:t>7</w:t>
+            </w:r>
+            <w:r>
+              <w:fldChar w:fldCharType="end"/>
+            </w:r>
+          </w:hyperlink>
+        </w:p>
+        <w:p>
+          <w:pPr>
+            <w:pStyle w:val="11"/>
+            <w:ind w:left="360"/>
+            <w:tabs>
+              <w:tab w:val="right" w:leader="dot" w:pos="9026"/>
+            </w:tabs>
+            <w:spacing w:before="120" w:after="60"/>
+          </w:pPr>
+          <w:hyperlink w:anchor="_Toc100011" w:history="1">
+            <w:r>
+              <w:rPr>
+                <w:rStyle w:val="Hyperlink"/>
+              </w:rPr>
+              <w:t>4.2. The cascade budget and the matching</w:t>
+            </w:r>
+            <w:r>
+              <w:tab/>
+            </w:r>
+            <w:r>
+              <w:fldChar w:fldCharType="begin"/>
+            </w:r>
+            <w:r>
+              <w:instrText xml:space="preserve"> PAGEREF _Toc100011 \h </w:instrText>
+            </w:r>
+            <w:r>
+              <w:fldChar w:fldCharType="separate"/>
+            </w:r>
+            <w:r>
+              <w:t>7</w:t>
+            </w:r>
+            <w:r>
+              <w:fldChar w:fldCharType="end"/>
+            </w:r>
+          </w:hyperlink>
+        </w:p>
+        <w:p>
+          <w:pPr>
+            <w:pStyle w:val="11"/>
+            <w:ind w:left="360"/>
+            <w:tabs>
+              <w:tab w:val="right" w:leader="dot" w:pos="9026"/>
+            </w:tabs>
+            <w:spacing w:before="120" w:after="60"/>
+          </w:pPr>
+          <w:hyperlink w:anchor="_Toc100012" w:history="1">
+            <w:r>
+              <w:rPr>
+                <w:rStyle w:val="Hyperlink"/>
+              </w:rPr>
+              <w:t>4.3. The filter family</w:t>
+            </w:r>
+            <w:r>
+              <w:tab/>
+            </w:r>
+            <w:r>
+              <w:fldChar w:fldCharType="begin"/>
+            </w:r>
+            <w:r>
+              <w:instrText xml:space="preserve"> PAGEREF _Toc100012 \h </w:instrText>
+            </w:r>
+            <w:r>
+              <w:fldChar w:fldCharType="separate"/>
+            </w:r>
+            <w:r>
+              <w:t>8</w:t>
+            </w:r>
+            <w:r>
+              <w:fldChar w:fldCharType="end"/>
+            </w:r>
+          </w:hyperlink>
+        </w:p>
+        <w:p>
+          <w:pPr>
+            <w:pStyle w:val="11"/>
+            <w:ind w:left="360"/>
+            <w:tabs>
+              <w:tab w:val="right" w:leader="dot" w:pos="9026"/>
+            </w:tabs>
+            <w:spacing w:before="120" w:after="60"/>
+          </w:pPr>
+          <w:hyperlink w:anchor="_Toc100013" w:history="1">
+            <w:r>
+              <w:rPr>
+                <w:rStyle w:val="Hyperlink"/>
+              </w:rPr>
+              <w:t>4.4. Sensitivity to the viscous tail</w:t>
+            </w:r>
+            <w:r>
+              <w:tab/>
+            </w:r>
+            <w:r>
+              <w:fldChar w:fldCharType="begin"/>
+            </w:r>
+            <w:r>
+              <w:instrText xml:space="preserve"> PAGEREF _Toc100013 \h </w:instrText>
+            </w:r>
+            <w:r>
+              <w:fldChar w:fldCharType="separate"/>
+            </w:r>
+            <w:r>
+              <w:t>9</w:t>
+            </w:r>
+            <w:r>
+              <w:fldChar w:fldCharType="end"/>
+            </w:r>
+          </w:hyperlink>
+        </w:p>
+        <w:p>
+          <w:pPr>
+            <w:pStyle w:val="9"/>
+            <w:tabs>
+              <w:tab w:val="right" w:leader="dot" w:pos="9026"/>
+            </w:tabs>
+            <w:spacing w:before="120" w:after="60"/>
+          </w:pPr>
+          <w:hyperlink w:anchor="_Toc100014" w:history="1">
+            <w:r>
+              <w:rPr>
+                <w:rStyle w:val="Hyperlink"/>
+              </w:rPr>
+              <w:t>5. Derivation II: closures for the Kolmogorov constant</w:t>
+            </w:r>
+            <w:r>
+              <w:tab/>
+            </w:r>
+            <w:r>
+              <w:fldChar w:fldCharType="begin"/>
+            </w:r>
+            <w:r>
+              <w:instrText xml:space="preserve"> PAGEREF _Toc100014 \h </w:instrText>
+            </w:r>
+            <w:r>
+              <w:fldChar w:fldCharType="separate"/>
+            </w:r>
+            <w:r>
+              <w:t>10</w:t>
+            </w:r>
+            <w:r>
+              <w:fldChar w:fldCharType="end"/>
+            </w:r>
+          </w:hyperlink>
+        </w:p>
+        <w:p>
+          <w:pPr>
+            <w:pStyle w:val="11"/>
+            <w:ind w:left="360"/>
+            <w:tabs>
+              <w:tab w:val="right" w:leader="dot" w:pos="9026"/>
+            </w:tabs>
+            <w:spacing w:before="120" w:after="60"/>
+          </w:pPr>
+          <w:hyperlink w:anchor="_Toc100015" w:history="1">
+            <w:r>
+              <w:rPr>
+                <w:rStyle w:val="Hyperlink"/>
+              </w:rPr>
+              <w:t>5.1. The Heisenberg spectral balance</w:t>
+            </w:r>
+            <w:r>
+              <w:tab/>
+            </w:r>
+            <w:r>
+              <w:fldChar w:fldCharType="begin"/>
+            </w:r>
+            <w:r>
+              <w:instrText xml:space="preserve"> PAGEREF _Toc100015 \h </w:instrText>
+            </w:r>
+            <w:r>
+              <w:fldChar w:fldCharType="separate"/>
+            </w:r>
+            <w:r>
+              <w:t>10</w:t>
+            </w:r>
+            <w:r>
+              <w:fldChar w:fldCharType="end"/>
+            </w:r>
+          </w:hyperlink>
+        </w:p>
+        <w:p>
+          <w:pPr>
+            <w:pStyle w:val="11"/>
+            <w:ind w:left="360"/>
+            <w:tabs>
+              <w:tab w:val="right" w:leader="dot" w:pos="9026"/>
+            </w:tabs>
+            <w:spacing w:before="120" w:after="60"/>
+          </w:pPr>
+          <w:hyperlink w:anchor="_Toc100016" w:history="1">
+            <w:r>
+              <w:rPr>
+                <w:rStyle w:val="Hyperlink"/>
+              </w:rPr>
+              <w:t>5.2. The Pao spectrum with exact dissipation normalization</w:t>
+            </w:r>
+            <w:r>
+              <w:tab/>
+            </w:r>
+            <w:r>
+              <w:fldChar w:fldCharType="begin"/>
+            </w:r>
+            <w:r>
+              <w:instrText xml:space="preserve"> PAGEREF _Toc100016 \h </w:instrText>
+            </w:r>
+            <w:r>
+              <w:fldChar w:fldCharType="separate"/>
+            </w:r>
+            <w:r>
+              <w:t>11</w:t>
+            </w:r>
+            <w:r>
+              <w:fldChar w:fldCharType="end"/>
+            </w:r>
+          </w:hyperlink>
+        </w:p>
+        <w:p>
+          <w:pPr>
+            <w:pStyle w:val="11"/>
+            <w:ind w:left="360"/>
+            <w:tabs>
+              <w:tab w:val="right" w:leader="dot" w:pos="9026"/>
+            </w:tabs>
+            <w:spacing w:before="120" w:after="60"/>
+          </w:pPr>
+          <w:hyperlink w:anchor="_Toc100017" w:history="1">
+            <w:r>
+              <w:rPr>
+                <w:rStyle w:val="Hyperlink"/>
+              </w:rPr>
+              <w:t>5.3. Comparing the closures</w:t>
+            </w:r>
+            <w:r>
+              <w:tab/>
+            </w:r>
+            <w:r>
+              <w:fldChar w:fldCharType="begin"/>
+            </w:r>
+            <w:r>
+              <w:instrText xml:space="preserve"> PAGEREF _Toc100017 \h </w:instrText>
+            </w:r>
+            <w:r>
+              <w:fldChar w:fldCharType="separate"/>
+            </w:r>
+            <w:r>
+              <w:t>12</w:t>
+            </w:r>
+            <w:r>
+              <w:fldChar w:fldCharType="end"/>
+            </w:r>
+          </w:hyperlink>
+        </w:p>
+        <w:p>
+          <w:pPr>
+            <w:pStyle w:val="9"/>
+            <w:tabs>
+              <w:tab w:val="right" w:leader="dot" w:pos="9026"/>
+            </w:tabs>
+            <w:spacing w:before="120" w:after="60"/>
+          </w:pPr>
+          <w:hyperlink w:anchor="_Toc100018" w:history="1">
+            <w:r>
+              <w:rPr>
+                <w:rStyle w:val="Hyperlink"/>
+              </w:rPr>
+              <w:t>6. The dynamic Germano procedure</w:t>
+            </w:r>
+            <w:r>
+              <w:tab/>
+            </w:r>
+            <w:r>
+              <w:fldChar w:fldCharType="begin"/>
+            </w:r>
+            <w:r>
+              <w:instrText xml:space="preserve"> PAGEREF _Toc100018 \h </w:instrText>
+            </w:r>
+            <w:r>
+              <w:fldChar w:fldCharType="separate"/>
+            </w:r>
+            <w:r>
+              <w:t>13</w:t>
+            </w:r>
+            <w:r>
+              <w:fldChar w:fldCharType="end"/>
+            </w:r>
+          </w:hyperlink>
+        </w:p>
+        <w:p>
+          <w:pPr>
+            <w:pStyle w:val="9"/>
+            <w:tabs>
+              <w:tab w:val="right" w:leader="dot" w:pos="9026"/>
+            </w:tabs>
+            <w:spacing w:before="120" w:after="60"/>
+          </w:pPr>
+          <w:hyperlink w:anchor="_Toc100019" w:history="1">
+            <w:r>
+              <w:rPr>
+                <w:rStyle w:val="Hyperlink"/>
+              </w:rPr>
+              <w:t>7. Intermittency and the limits of the Gaussian approximation</w:t>
+            </w:r>
+            <w:r>
+              <w:tab/>
+            </w:r>
+            <w:r>
+              <w:fldChar w:fldCharType="begin"/>
+            </w:r>
+            <w:r>
+              <w:instrText xml:space="preserve"> PAGEREF _Toc100019 \h </w:instrText>
+            </w:r>
+            <w:r>
+              <w:fldChar w:fldCharType="separate"/>
+            </w:r>
+            <w:r>
+              <w:t>13</w:t>
+            </w:r>
+            <w:r>
+              <w:fldChar w:fldCharType="end"/>
+            </w:r>
+          </w:hyperlink>
+        </w:p>
+        <w:p>
+          <w:pPr>
+            <w:pStyle w:val="11"/>
+            <w:ind w:left="360"/>
+            <w:tabs>
+              <w:tab w:val="right" w:leader="dot" w:pos="9026"/>
+            </w:tabs>
+            <w:spacing w:before="120" w:after="60"/>
+          </w:pPr>
+          <w:hyperlink w:anchor="_Toc100020" w:history="1">
+            <w:r>
+              <w:rPr>
+                <w:rStyle w:val="Hyperlink"/>
+              </w:rPr>
+              <w:t>7.1. The vanishing Germano correlation on Gaussian fields</w:t>
+            </w:r>
+            <w:r>
+              <w:tab/>
+            </w:r>
+            <w:r>
+              <w:fldChar w:fldCharType="begin"/>
+            </w:r>
+            <w:r>
+              <w:instrText xml:space="preserve"> PAGEREF _Toc100020 \h </w:instrText>
+            </w:r>
+            <w:r>
+              <w:fldChar w:fldCharType="separate"/>
+            </w:r>
+            <w:r>
+              <w:t>13</w:t>
+            </w:r>
+            <w:r>
+              <w:fldChar w:fldCharType="end"/>
+            </w:r>
+          </w:hyperlink>
+        </w:p>
+        <w:p>
+          <w:pPr>
+            <w:pStyle w:val="11"/>
+            <w:ind w:left="360"/>
+            <w:tabs>
+              <w:tab w:val="right" w:leader="dot" w:pos="9026"/>
+            </w:tabs>
+            <w:spacing w:before="120" w:after="60"/>
+          </w:pPr>
+          <w:hyperlink w:anchor="_Toc100021" w:history="1">
+            <w:r>
+              <w:rPr>
+                <w:rStyle w:val="Hyperlink"/>
+              </w:rPr>
+              <w:t>7.2. Intermittency and the literature spread</w:t>
+            </w:r>
+            <w:r>
+              <w:tab/>
+            </w:r>
+            <w:r>
+              <w:fldChar w:fldCharType="begin"/>
+            </w:r>
+            <w:r>
+              <w:instrText xml:space="preserve"> PAGEREF _Toc100021 \h </w:instrText>
+            </w:r>
+            <w:r>
+              <w:fldChar w:fldCharType="separate"/>
+            </w:r>
+            <w:r>
+              <w:t>14</w:t>
+            </w:r>
+            <w:r>
+              <w:fldChar w:fldCharType="end"/>
+            </w:r>
+          </w:hyperlink>
+        </w:p>
+        <w:p>
+          <w:pPr>
+            <w:pStyle w:val="9"/>
+            <w:tabs>
+              <w:tab w:val="right" w:leader="dot" w:pos="9026"/>
+            </w:tabs>
+            <w:spacing w:before="120" w:after="60"/>
+          </w:pPr>
+          <w:hyperlink w:anchor="_Toc100022" w:history="1">
+            <w:r>
+              <w:rPr>
+                <w:rStyle w:val="Hyperlink"/>
+              </w:rPr>
+              <w:t>8. Experiment I: verification on synthetic fields (P3)</w:t>
+            </w:r>
+            <w:r>
+              <w:tab/>
+            </w:r>
+            <w:r>
+              <w:fldChar w:fldCharType="begin"/>
+            </w:r>
+            <w:r>
+              <w:instrText xml:space="preserve"> PAGEREF _Toc100022 \h </w:instrText>
+            </w:r>
+            <w:r>
+              <w:fldChar w:fldCharType="separate"/>
+            </w:r>
+            <w:r>
+              <w:t>14</w:t>
+            </w:r>
+            <w:r>
+              <w:fldChar w:fldCharType="end"/>
+            </w:r>
+          </w:hyperlink>
+        </w:p>
+        <w:p>
+          <w:pPr>
+            <w:pStyle w:val="11"/>
+            <w:ind w:left="360"/>
+            <w:tabs>
+              <w:tab w:val="right" w:leader="dot" w:pos="9026"/>
+            </w:tabs>
+            <w:spacing w:before="120" w:after="60"/>
+          </w:pPr>
+          <w:hyperlink w:anchor="_Toc100023" w:history="1">
+            <w:r>
+              <w:rPr>
+                <w:rStyle w:val="Hyperlink"/>
+              </w:rPr>
+              <w:t>8.1. Setup</w:t>
+            </w:r>
+            <w:r>
+              <w:tab/>
+            </w:r>
+            <w:r>
+              <w:fldChar w:fldCharType="begin"/>
+            </w:r>
+            <w:r>
+              <w:instrText xml:space="preserve"> PAGEREF _Toc100023 \h </w:instrText>
+            </w:r>
+            <w:r>
+              <w:fldChar w:fldCharType="separate"/>
+            </w:r>
+            <w:r>
+              <w:t>15</w:t>
+            </w:r>
+            <w:r>
+              <w:fldChar w:fldCharType="end"/>
+            </w:r>
+          </w:hyperlink>
+        </w:p>
+        <w:p>
+          <w:pPr>
+            <w:pStyle w:val="11"/>
+            <w:ind w:left="360"/>
+            <w:tabs>
+              <w:tab w:val="right" w:leader="dot" w:pos="9026"/>
+            </w:tabs>
+            <w:spacing w:before="120" w:after="60"/>
+          </w:pPr>
+          <w:hyperlink w:anchor="_Toc100024" w:history="1">
+            <w:r>
+              <w:rPr>
+                <w:rStyle w:val="Hyperlink"/>
+              </w:rPr>
+              <w:t>8.2. Verifying the spectral inputs</w:t>
+            </w:r>
+            <w:r>
+              <w:tab/>
+            </w:r>
+            <w:r>
+              <w:fldChar w:fldCharType="begin"/>
+            </w:r>
+            <w:r>
+              <w:instrText xml:space="preserve"> PAGEREF _Toc100024 \h </w:instrText>
+            </w:r>
+            <w:r>
+              <w:fldChar w:fldCharType="separate"/>
+            </w:r>
+            <w:r>
+              <w:t>15</w:t>
+            </w:r>
+            <w:r>
+              <w:fldChar w:fldCharType="end"/>
+            </w:r>
+          </w:hyperlink>
+        </w:p>
+        <w:p>
+          <w:pPr>
+            <w:pStyle w:val="11"/>
+            <w:ind w:left="360"/>
+            <w:tabs>
+              <w:tab w:val="right" w:leader="dot" w:pos="9026"/>
+            </w:tabs>
+            <w:spacing w:before="120" w:after="60"/>
+          </w:pPr>
+          <w:hyperlink w:anchor="_Toc100025" w:history="1">
+            <w:r>
+              <w:rPr>
+                <w:rStyle w:val="Hyperlink"/>
+              </w:rPr>
+              <w:t>8.3. The convergence C_s(Δ/η) and the vanishing correlation</w:t>
+            </w:r>
+            <w:r>
+              <w:tab/>
+            </w:r>
+            <w:r>
+              <w:fldChar w:fldCharType="begin"/>
+            </w:r>
+            <w:r>
+              <w:instrText xml:space="preserve"> PAGEREF _Toc100025 \h </w:instrText>
+            </w:r>
+            <w:r>
+              <w:fldChar w:fldCharType="separate"/>
+            </w:r>
+            <w:r>
+              <w:t>15</w:t>
+            </w:r>
+            <w:r>
+              <w:fldChar w:fldCharType="end"/>
+            </w:r>
+          </w:hyperlink>
+        </w:p>
+        <w:p>
+          <w:pPr>
+            <w:pStyle w:val="9"/>
+            <w:tabs>
+              <w:tab w:val="right" w:leader="dot" w:pos="9026"/>
+            </w:tabs>
+            <w:spacing w:before="120" w:after="60"/>
+          </w:pPr>
+          <w:hyperlink w:anchor="_Toc100026" w:history="1">
+            <w:r>
+              <w:rPr>
+                <w:rStyle w:val="Hyperlink"/>
+              </w:rPr>
+              <w:t>9. Experiment II: DNS and a priori tests (P4)</w:t>
+            </w:r>
+            <w:r>
+              <w:tab/>
+            </w:r>
+            <w:r>
+              <w:fldChar w:fldCharType="begin"/>
+            </w:r>
+            <w:r>
+              <w:instrText xml:space="preserve"> PAGEREF _Toc100026 \h </w:instrText>
+            </w:r>
+            <w:r>
+              <w:fldChar w:fldCharType="separate"/>
+            </w:r>
+            <w:r>
+              <w:t>16</w:t>
+            </w:r>
+            <w:r>
+              <w:fldChar w:fldCharType="end"/>
+            </w:r>
+          </w:hyperlink>
+        </w:p>
+        <w:p>
+          <w:pPr>
+            <w:pStyle w:val="11"/>
+            <w:ind w:left="360"/>
+            <w:tabs>
+              <w:tab w:val="right" w:leader="dot" w:pos="9026"/>
+            </w:tabs>
+            <w:spacing w:before="120" w:after="60"/>
+          </w:pPr>
+          <w:hyperlink w:anchor="_Toc100027" w:history="1">
+            <w:r>
+              <w:rPr>
+                <w:rStyle w:val="Hyperlink"/>
+              </w:rPr>
+              <w:t>9.1. Setup of the numerical experiment</w:t>
+            </w:r>
+            <w:r>
+              <w:tab/>
+            </w:r>
+            <w:r>
+              <w:fldChar w:fldCharType="begin"/>
+            </w:r>
+            <w:r>
+              <w:instrText xml:space="preserve"> PAGEREF _Toc100027 \h </w:instrText>
+            </w:r>
+            <w:r>
+              <w:fldChar w:fldCharType="separate"/>
+            </w:r>
+            <w:r>
+              <w:t>16</w:t>
+            </w:r>
+            <w:r>
+              <w:fldChar w:fldCharType="end"/>
+            </w:r>
+          </w:hyperlink>
+        </w:p>
+        <w:p>
+          <w:pPr>
+            <w:pStyle w:val="11"/>
+            <w:ind w:left="360"/>
+            <w:tabs>
+              <w:tab w:val="right" w:leader="dot" w:pos="9026"/>
+            </w:tabs>
+            <w:spacing w:before="120" w:after="60"/>
+          </w:pPr>
+          <w:hyperlink w:anchor="_Toc100028" w:history="1">
+            <w:r>
+              <w:rPr>
+                <w:rStyle w:val="Hyperlink"/>
+              </w:rPr>
+              <w:t>9.2. The a priori test on real turbulence</w:t>
+            </w:r>
+            <w:r>
+              <w:tab/>
+            </w:r>
+            <w:r>
+              <w:fldChar w:fldCharType="begin"/>
+            </w:r>
+            <w:r>
+              <w:instrText xml:space="preserve"> PAGEREF _Toc100028 \h </w:instrText>
+            </w:r>
+            <w:r>
+              <w:fldChar w:fldCharType="separate"/>
+            </w:r>
+            <w:r>
+              <w:t>16</w:t>
+            </w:r>
+            <w:r>
+              <w:fldChar w:fldCharType="end"/>
+            </w:r>
+          </w:hyperlink>
+        </w:p>
+        <w:p>
+          <w:pPr>
+            <w:pStyle w:val="11"/>
+            <w:ind w:left="360"/>
+            <w:tabs>
+              <w:tab w:val="right" w:leader="dot" w:pos="9026"/>
+            </w:tabs>
+            <w:spacing w:before="120" w:after="60"/>
+          </w:pPr>
+          <w:hyperlink w:anchor="_Toc100029" w:history="1">
+            <w:r>
+              <w:rPr>
+                <w:rStyle w:val="Hyperlink"/>
+              </w:rPr>
+              <w:t>9.3. An honest error budget</w:t>
+            </w:r>
+            <w:r>
+              <w:tab/>
+            </w:r>
+            <w:r>
+              <w:fldChar w:fldCharType="begin"/>
+            </w:r>
+            <w:r>
+              <w:instrText xml:space="preserve"> PAGEREF _Toc100029 \h </w:instrText>
+            </w:r>
+            <w:r>
+              <w:fldChar w:fldCharType="separate"/>
+            </w:r>
+            <w:r>
+              <w:t>17</w:t>
+            </w:r>
+            <w:r>
+              <w:fldChar w:fldCharType="end"/>
+            </w:r>
+          </w:hyperlink>
+        </w:p>
+        <w:p>
+          <w:pPr>
+            <w:pStyle w:val="9"/>
+            <w:tabs>
+              <w:tab w:val="right" w:leader="dot" w:pos="9026"/>
+            </w:tabs>
+            <w:spacing w:before="120" w:after="60"/>
+          </w:pPr>
+          <w:hyperlink w:anchor="_Toc100030" w:history="1">
+            <w:r>
+              <w:rPr>
+                <w:rStyle w:val="Hyperlink"/>
+              </w:rPr>
+              <w:t>10. Consolidated results and the literature</w:t>
+            </w:r>
+            <w:r>
+              <w:tab/>
+            </w:r>
+            <w:r>
+              <w:fldChar w:fldCharType="begin"/>
+            </w:r>
+            <w:r>
+              <w:instrText xml:space="preserve"> PAGEREF _Toc100030 \h </w:instrText>
+            </w:r>
+            <w:r>
+              <w:fldChar w:fldCharType="separate"/>
+            </w:r>
+            <w:r>
+              <w:t>17</w:t>
+            </w:r>
+            <w:r>
+              <w:fldChar w:fldCharType="end"/>
+            </w:r>
+          </w:hyperlink>
+        </w:p>
+        <w:p>
+          <w:pPr>
+            <w:pStyle w:val="9"/>
+            <w:tabs>
+              <w:tab w:val="right" w:leader="dot" w:pos="9026"/>
+            </w:tabs>
+            <w:spacing w:before="120" w:after="60"/>
+          </w:pPr>
+          <w:hyperlink w:anchor="_Toc100031" w:history="1">
+            <w:r>
+              <w:rPr>
+                <w:rStyle w:val="Hyperlink"/>
+              </w:rPr>
+              <w:t>11. The program inside the b-correction framework</w:t>
+            </w:r>
+            <w:r>
+              <w:tab/>
+            </w:r>
+            <w:r>
+              <w:fldChar w:fldCharType="begin"/>
+            </w:r>
+            <w:r>
+              <w:instrText xml:space="preserve"> PAGEREF _Toc100031 \h </w:instrText>
+            </w:r>
+            <w:r>
+              <w:fldChar w:fldCharType="separate"/>
+            </w:r>
+            <w:r>
+              <w:t>18</w:t>
+            </w:r>
+            <w:r>
+              <w:fldChar w:fldCharType="end"/>
+            </w:r>
+          </w:hyperlink>
+        </w:p>
+        <w:p>
+          <w:pPr>
+            <w:pStyle w:val="9"/>
+            <w:tabs>
+              <w:tab w:val="right" w:leader="dot" w:pos="9026"/>
+            </w:tabs>
+            <w:spacing w:before="120" w:after="60"/>
+          </w:pPr>
+          <w:hyperlink w:anchor="_Toc100032" w:history="1">
+            <w:r>
+              <w:rPr>
+                <w:rStyle w:val="Hyperlink"/>
+              </w:rPr>
+              <w:t>12. 3D smoothness: regularity criteria, the b-protocol and spectral certificates</w:t>
+            </w:r>
+            <w:r>
+              <w:tab/>
+            </w:r>
+            <w:r>
+              <w:fldChar w:fldCharType="begin"/>
+            </w:r>
+            <w:r>
+              <w:instrText xml:space="preserve"> PAGEREF _Toc100032 \h </w:instrText>
+            </w:r>
+            <w:r>
+              <w:fldChar w:fldCharType="separate"/>
+            </w:r>
+            <w:r>
+              <w:t>19</w:t>
+            </w:r>
+            <w:r>
+              <w:fldChar w:fldCharType="end"/>
+            </w:r>
+          </w:hyperlink>
+        </w:p>
+        <w:p>
+          <w:pPr>
+            <w:pStyle w:val="11"/>
+            <w:ind w:left="360"/>
+            <w:tabs>
+              <w:tab w:val="right" w:leader="dot" w:pos="9026"/>
+            </w:tabs>
+            <w:spacing w:before="120" w:after="60"/>
+          </w:pPr>
+          <w:hyperlink w:anchor="_Toc100033" w:history="1">
+            <w:r>
+              <w:rPr>
+                <w:rStyle w:val="Hyperlink"/>
+              </w:rPr>
+              <w:t>12.1. What the criteria hierarchy looks like</w:t>
+            </w:r>
+            <w:r>
+              <w:tab/>
+            </w:r>
+            <w:r>
+              <w:fldChar w:fldCharType="begin"/>
+            </w:r>
+            <w:r>
+              <w:instrText xml:space="preserve"> PAGEREF _Toc100033 \h </w:instrText>
+            </w:r>
+            <w:r>
+              <w:fldChar w:fldCharType="separate"/>
+            </w:r>
+            <w:r>
+              <w:t>20</w:t>
+            </w:r>
+            <w:r>
+              <w:fldChar w:fldCharType="end"/>
+            </w:r>
+          </w:hyperlink>
+        </w:p>
+        <w:p>
+          <w:pPr>
+            <w:pStyle w:val="11"/>
+            <w:ind w:left="360"/>
+            <w:tabs>
+              <w:tab w:val="right" w:leader="dot" w:pos="9026"/>
+            </w:tabs>
+            <w:spacing w:before="120" w:after="60"/>
+          </w:pPr>
+          <w:hyperlink w:anchor="_Toc100034" w:history="1">
+            <w:r>
+              <w:rPr>
+                <w:rStyle w:val="Hyperlink"/>
+              </w:rPr>
+              <w:t>12.2. Vorticity stretching and the enstrophy balance</w:t>
+            </w:r>
+            <w:r>
+              <w:tab/>
+            </w:r>
+            <w:r>
+              <w:fldChar w:fldCharType="begin"/>
+            </w:r>
+            <w:r>
+              <w:instrText xml:space="preserve"> PAGEREF _Toc100034 \h </w:instrText>
+            </w:r>
+            <w:r>
+              <w:fldChar w:fldCharType="separate"/>
+            </w:r>
+            <w:r>
+              <w:t>21</w:t>
+            </w:r>
+            <w:r>
+              <w:fldChar w:fldCharType="end"/>
+            </w:r>
+          </w:hyperlink>
+        </w:p>
+        <w:p>
+          <w:pPr>
+            <w:pStyle w:val="11"/>
+            <w:ind w:left="360"/>
+            <w:tabs>
+              <w:tab w:val="right" w:leader="dot" w:pos="9026"/>
+            </w:tabs>
+            <w:spacing w:before="120" w:after="60"/>
+          </w:pPr>
+          <w:hyperlink w:anchor="_Toc100035" w:history="1">
+            <w:r>
+              <w:rPr>
+                <w:rStyle w:val="Hyperlink"/>
+              </w:rPr>
+              <w:t>12.3. The b-protocol on the 48³ Taylor-Green vortex</w:t>
+            </w:r>
+            <w:r>
+              <w:tab/>
+            </w:r>
+            <w:r>
+              <w:fldChar w:fldCharType="begin"/>
+            </w:r>
+            <w:r>
+              <w:instrText xml:space="preserve"> PAGEREF _Toc100035 \h </w:instrText>
+            </w:r>
+            <w:r>
+              <w:fldChar w:fldCharType="separate"/>
+            </w:r>
+            <w:r>
+              <w:t>22</w:t>
+            </w:r>
+            <w:r>
+              <w:fldChar w:fldCharType="end"/>
+            </w:r>
+          </w:hyperlink>
+        </w:p>
+        <w:p>
+          <w:pPr>
+            <w:pStyle w:val="11"/>
+            <w:ind w:left="360"/>
+            <w:tabs>
+              <w:tab w:val="right" w:leader="dot" w:pos="9026"/>
+            </w:tabs>
+            <w:spacing w:before="120" w:after="60"/>
+          </w:pPr>
+          <w:hyperlink w:anchor="_Toc100036" w:history="1">
+            <w:r>
+              <w:rPr>
+                <w:rStyle w:val="Hyperlink"/>
+              </w:rPr>
+              <w:t>12.4. The hyperdissipative family and the universal dissipation peak</w:t>
+            </w:r>
+            <w:r>
+              <w:tab/>
+            </w:r>
+            <w:r>
+              <w:fldChar w:fldCharType="begin"/>
+            </w:r>
+            <w:r>
+              <w:instrText xml:space="preserve"> PAGEREF _Toc100036 \h </w:instrText>
+            </w:r>
+            <w:r>
+              <w:fldChar w:fldCharType="separate"/>
+            </w:r>
+            <w:r>
+              <w:t>22</w:t>
+            </w:r>
+            <w:r>
+              <w:fldChar w:fldCharType="end"/>
+            </w:r>
+          </w:hyperlink>
+        </w:p>
+        <w:p>
+          <w:pPr>
+            <w:pStyle w:val="11"/>
+            <w:ind w:left="360"/>
+            <w:tabs>
+              <w:tab w:val="right" w:leader="dot" w:pos="9026"/>
+            </w:tabs>
+            <w:spacing w:before="120" w:after="60"/>
+          </w:pPr>
+          <w:hyperlink w:anchor="_Toc100037" w:history="1">
+            <w:r>
+              <w:rPr>
+                <w:rStyle w:val="Hyperlink"/>
+              </w:rPr>
+              <w:t>12.5. The spectral smoothness certificate</w:t>
+            </w:r>
+            <w:r>
+              <w:tab/>
+            </w:r>
+            <w:r>
+              <w:fldChar w:fldCharType="begin"/>
+            </w:r>
+            <w:r>
+              <w:instrText xml:space="preserve"> PAGEREF _Toc100037 \h </w:instrText>
+            </w:r>
+            <w:r>
+              <w:fldChar w:fldCharType="separate"/>
+            </w:r>
+            <w:r>
+              <w:t>24</w:t>
+            </w:r>
+            <w:r>
+              <w:fldChar w:fldCharType="end"/>
+            </w:r>
+          </w:hyperlink>
+        </w:p>
+        <w:p>
+          <w:pPr>
+            <w:pStyle w:val="11"/>
+            <w:ind w:left="360"/>
+            <w:tabs>
+              <w:tab w:val="right" w:leader="dot" w:pos="9026"/>
+            </w:tabs>
+            <w:spacing w:before="120" w:after="60"/>
+          </w:pPr>
+          <w:hyperlink w:anchor="_Toc100038" w:history="1">
+            <w:r>
+              <w:rPr>
+                <w:rStyle w:val="Hyperlink"/>
+              </w:rPr>
+              <w:t>12.6. Protocol P5 and the three-language verification</w:t>
+            </w:r>
+            <w:r>
+              <w:tab/>
+            </w:r>
+            <w:r>
+              <w:fldChar w:fldCharType="begin"/>
+            </w:r>
+            <w:r>
+              <w:instrText xml:space="preserve"> PAGEREF _Toc100038 \h </w:instrText>
+            </w:r>
+            <w:r>
+              <w:fldChar w:fldCharType="separate"/>
+            </w:r>
+            <w:r>
+              <w:t>25</w:t>
+            </w:r>
+            <w:r>
+              <w:fldChar w:fldCharType="end"/>
+            </w:r>
+          </w:hyperlink>
+        </w:p>
+        <w:p>
+          <w:pPr>
+            <w:pStyle w:val="11"/>
+            <w:ind w:left="360"/>
+            <w:tabs>
+              <w:tab w:val="right" w:leader="dot" w:pos="9026"/>
+            </w:tabs>
+            <w:spacing w:before="120" w:after="60"/>
+          </w:pPr>
+          <w:hyperlink w:anchor="_Toc100039" w:history="1">
+            <w:r>
+              <w:rPr>
+                <w:rStyle w:val="Hyperlink"/>
+              </w:rPr>
+              <w:t>12.7. What this chapter does and does not establish</w:t>
+            </w:r>
+            <w:r>
+              <w:tab/>
+            </w:r>
+            <w:r>
+              <w:fldChar w:fldCharType="begin"/>
+            </w:r>
+            <w:r>
+              <w:instrText xml:space="preserve"> PAGEREF _Toc100039 \h </w:instrText>
+            </w:r>
+            <w:r>
+              <w:fldChar w:fldCharType="separate"/>
+            </w:r>
+            <w:r>
+              <w:t>25</w:t>
+            </w:r>
+            <w:r>
+              <w:fldChar w:fldCharType="end"/>
+            </w:r>
+          </w:hyperlink>
+        </w:p>
+        <w:p>
+          <w:pPr>
+            <w:pStyle w:val="9"/>
+            <w:tabs>
+              <w:tab w:val="right" w:leader="dot" w:pos="9026"/>
+            </w:tabs>
+            <w:spacing w:before="120" w:after="60"/>
+          </w:pPr>
+          <w:hyperlink w:anchor="_Toc100040" w:history="1">
+            <w:r>
+              <w:rPr>
+                <w:rStyle w:val="Hyperlink"/>
+              </w:rPr>
+              <w:t>13. Discussion: what is and is not claimed</w:t>
+            </w:r>
+            <w:r>
+              <w:tab/>
+            </w:r>
+            <w:r>
+              <w:fldChar w:fldCharType="begin"/>
+            </w:r>
+            <w:r>
+              <w:instrText xml:space="preserve"> PAGEREF _Toc100040 \h </w:instrText>
+            </w:r>
+            <w:r>
+              <w:fldChar w:fldCharType="separate"/>
+            </w:r>
+            <w:r>
+              <w:t>25</w:t>
+            </w:r>
+            <w:r>
+              <w:fldChar w:fldCharType="end"/>
+            </w:r>
+          </w:hyperlink>
+        </w:p>
+        <w:p>
+          <w:pPr>
+            <w:pStyle w:val="9"/>
+            <w:tabs>
+              <w:tab w:val="right" w:leader="dot" w:pos="9026"/>
+            </w:tabs>
+            <w:spacing w:before="120" w:after="60"/>
+          </w:pPr>
+          <w:hyperlink w:anchor="_Toc100041" w:history="1">
+            <w:r>
+              <w:rPr>
+                <w:rStyle w:val="Hyperlink"/>
+              </w:rPr>
+              <w:t>14. Conclusions</w:t>
+            </w:r>
+            <w:r>
+              <w:tab/>
+            </w:r>
+            <w:r>
+              <w:fldChar w:fldCharType="begin"/>
+            </w:r>
+            <w:r>
+              <w:instrText xml:space="preserve"> PAGEREF _Toc100041 \h </w:instrText>
+            </w:r>
+            <w:r>
+              <w:fldChar w:fldCharType="separate"/>
+            </w:r>
+            <w:r>
+              <w:t>26</w:t>
+            </w:r>
+            <w:r>
+              <w:fldChar w:fldCharType="end"/>
+            </w:r>
+          </w:hyperlink>
+        </w:p>
+        <w:p>
+          <w:pPr>
+            <w:pStyle w:val="9"/>
+            <w:tabs>
+              <w:tab w:val="right" w:leader="dot" w:pos="9026"/>
+            </w:tabs>
+            <w:spacing w:before="120" w:after="60"/>
+          </w:pPr>
+          <w:hyperlink w:anchor="_Toc100042" w:history="1">
+            <w:r>
+              <w:rPr>
+                <w:rStyle w:val="Hyperlink"/>
+              </w:rPr>
+              <w:t>References</w:t>
+            </w:r>
+            <w:r>
+              <w:tab/>
+            </w:r>
+            <w:r>
+              <w:fldChar w:fldCharType="begin"/>
+            </w:r>
+            <w:r>
+              <w:instrText xml:space="preserve"> PAGEREF _Toc100042 \h </w:instrText>
+            </w:r>
+            <w:r>
+              <w:fldChar w:fldCharType="separate"/>
+            </w:r>
+            <w:r>
+              <w:t>26</w:t>
+            </w:r>
+            <w:r>
+              <w:fldChar w:fldCharType="end"/>
+            </w:r>
+          </w:hyperlink>
+        </w:p>
+        <w:p>
+          <w:pPr>
+            <w:pStyle w:val="9"/>
+            <w:tabs>
+              <w:tab w:val="right" w:leader="dot" w:pos="9026"/>
+            </w:tabs>
+            <w:spacing w:before="120" w:after="60"/>
+          </w:pPr>
+          <w:hyperlink w:anchor="_Toc100043" w:history="1">
+            <w:r>
+              <w:rPr>
+                <w:rStyle w:val="Hyperlink"/>
+              </w:rPr>
+              <w:t>Appendix A. Protocol parameters</w:t>
+            </w:r>
+            <w:r>
+              <w:tab/>
+            </w:r>
+            <w:r>
+              <w:fldChar w:fldCharType="begin"/>
+            </w:r>
+            <w:r>
+              <w:instrText xml:space="preserve"> PAGEREF _Toc100043 \h </w:instrText>
+            </w:r>
+            <w:r>
+              <w:fldChar w:fldCharType="separate"/>
+            </w:r>
+            <w:r>
+              <w:t>33</w:t>
+            </w:r>
+            <w:r>
+              <w:fldChar w:fldCharType="end"/>
+            </w:r>
+          </w:hyperlink>
+        </w:p>
+        <w:p>
+          <w:pPr>
+            <w:pStyle w:val="9"/>
+            <w:tabs>
+              <w:tab w:val="right" w:leader="dot" w:pos="9026"/>
+            </w:tabs>
+            <w:spacing w:before="120" w:after="60"/>
+          </w:pPr>
+          <w:hyperlink w:anchor="_Toc100044" w:history="1">
+            <w:r>
+              <w:rPr>
+                <w:rStyle w:val="Hyperlink"/>
+              </w:rPr>
+              <w:t>Appendix B. The convention map and the factor-of-two trap</w:t>
+            </w:r>
+            <w:r>
+              <w:tab/>
+            </w:r>
+            <w:r>
+              <w:fldChar w:fldCharType="begin"/>
+            </w:r>
+            <w:r>
+              <w:instrText xml:space="preserve"> PAGEREF _Toc100044 \h </w:instrText>
+            </w:r>
+            <w:r>
+              <w:fldChar w:fldCharType="separate"/>
+            </w:r>
+            <w:r>
+              <w:t>33</w:t>
+            </w:r>
+            <w:r>
+              <w:fldChar w:fldCharType="end"/>
+            </w:r>
+          </w:hyperlink>
+        </w:p>
+        <w:p>
+          <w:pPr>
+            <w:pStyle w:val="9"/>
+            <w:tabs>
+              <w:tab w:val="right" w:leader="dot" w:pos="9026"/>
+            </w:tabs>
+            <w:spacing w:before="120" w:after="60"/>
+          </w:pPr>
+          <w:hyperlink w:anchor="_Toc100045" w:history="1">
+            <w:r>
+              <w:rPr>
+                <w:rStyle w:val="Hyperlink"/>
+              </w:rPr>
+              <w:t>Appendix C. Code map and reproducibility</w:t>
+            </w:r>
+            <w:r>
+              <w:tab/>
+            </w:r>
+            <w:r>
+              <w:fldChar w:fldCharType="begin"/>
+            </w:r>
+            <w:r>
+              <w:instrText xml:space="preserve"> PAGEREF _Toc100045 \h </w:instrText>
+            </w:r>
+            <w:r>
+              <w:fldChar w:fldCharType="separate"/>
+            </w:r>
+            <w:r>
+              <w:t>34</w:t>
+            </w:r>
+            <w:r>
+              <w:fldChar w:fldCharType="end"/>
+            </w:r>
+          </w:hyperlink>
         </w:p>
         <w:p>
           <w:r>
@@ -567,6 +2209,7 @@
         <w:pStyle w:val="Heading1"/>
         <w:spacing w:after="240" w:before="480" w:line="360"/>
       </w:pPr>
+      <w:bookmarkStart w:id="100000" w:name="_Toc100000"/>
       <w:r>
         <w:rPr>
           <w:rFonts w:ascii="Times New Roman" w:eastAsia="Times New Roman" w:hAnsi="Times New Roman"/>
@@ -578,6 +2221,7 @@
         </w:rPr>
         <w:t xml:space="preserve">1. Introduction: two constants and one question</w:t>
       </w:r>
+      <w:bookmarkEnd w:id="100000"/>
     </w:p>
     <w:p>
       <w:pPr>
@@ -664,6 +2308,7 @@
         <w:pStyle w:val="Heading1"/>
         <w:spacing w:after="240" w:before="480" w:line="360"/>
       </w:pPr>
+      <w:bookmarkStart w:id="100001" w:name="_Toc100001"/>
       <w:r>
         <w:rPr>
           <w:rFonts w:ascii="Times New Roman" w:eastAsia="Times New Roman" w:hAnsi="Times New Roman"/>
@@ -675,12 +2320,14 @@
         </w:rPr>
         <w:t xml:space="preserve">2. Mathematical apparatus</w:t>
       </w:r>
+      <w:bookmarkEnd w:id="100001"/>
     </w:p>
     <w:p>
       <w:pPr>
         <w:pStyle w:val="Heading2"/>
         <w:spacing w:after="160" w:before="320" w:line="360"/>
       </w:pPr>
+      <w:bookmarkStart w:id="100002" w:name="_Toc100002"/>
       <w:r>
         <w:rPr>
           <w:rFonts w:ascii="Times New Roman" w:eastAsia="Times New Roman" w:hAnsi="Times New Roman"/>
@@ -692,6 +2339,7 @@
         </w:rPr>
         <w:t xml:space="preserve">2.1. Equations and notation</w:t>
       </w:r>
+      <w:bookmarkEnd w:id="100002"/>
     </w:p>
     <w:p>
       <w:pPr>
@@ -929,6 +2577,7 @@
         <w:pStyle w:val="Heading2"/>
         <w:spacing w:after="160" w:before="320" w:line="360"/>
       </w:pPr>
+      <w:bookmarkStart w:id="100003" w:name="_Toc100003"/>
       <w:r>
         <w:rPr>
           <w:rFonts w:ascii="Times New Roman" w:eastAsia="Times New Roman" w:hAnsi="Times New Roman"/>
@@ -940,6 +2589,7 @@
         </w:rPr>
         <w:t xml:space="preserve">2.2. Filtering and the LES formalism</w:t>
       </w:r>
+      <w:bookmarkEnd w:id="100003"/>
     </w:p>
     <w:p>
       <w:pPr>
@@ -1116,6 +2766,7 @@
         <w:pStyle w:val="Heading2"/>
         <w:spacing w:after="160" w:before="320" w:line="360"/>
       </w:pPr>
+      <w:bookmarkStart w:id="100004" w:name="_Toc100004"/>
       <w:r>
         <w:rPr>
           <w:rFonts w:ascii="Times New Roman" w:eastAsia="Times New Roman" w:hAnsi="Times New Roman"/>
@@ -1127,6 +2778,7 @@
         </w:rPr>
         <w:t xml:space="preserve">2.3. Conventions that are usually left implicit</w:t>
       </w:r>
+      <w:bookmarkEnd w:id="100004"/>
     </w:p>
     <w:p>
       <w:pPr>
@@ -1149,6 +2801,7 @@
         <w:pStyle w:val="Heading1"/>
         <w:spacing w:after="240" w:before="480" w:line="360"/>
       </w:pPr>
+      <w:bookmarkStart w:id="100005" w:name="_Toc100005"/>
       <w:r>
         <w:rPr>
           <w:rFonts w:ascii="Times New Roman" w:eastAsia="Times New Roman" w:hAnsi="Times New Roman"/>
@@ -1160,12 +2813,14 @@
         </w:rPr>
         <w:t xml:space="preserve">3. K41 and what it cannot fix</w:t>
       </w:r>
+      <w:bookmarkEnd w:id="100005"/>
     </w:p>
     <w:p>
       <w:pPr>
         <w:pStyle w:val="Heading2"/>
         <w:spacing w:after="160" w:before="320" w:line="360"/>
       </w:pPr>
+      <w:bookmarkStart w:id="100006" w:name="_Toc100006"/>
       <w:r>
         <w:rPr>
           <w:rFonts w:ascii="Times New Roman" w:eastAsia="Times New Roman" w:hAnsi="Times New Roman"/>
@@ -1177,6 +2832,7 @@
         </w:rPr>
         <w:t xml:space="preserve">3.1. Kolmogorov's hypotheses and the −5/3 spectrum</w:t>
       </w:r>
+      <w:bookmarkEnd w:id="100006"/>
     </w:p>
     <w:p>
       <w:pPr>
@@ -1321,6 +2977,7 @@
         <w:pStyle w:val="Heading2"/>
         <w:spacing w:after="160" w:before="320" w:line="360"/>
       </w:pPr>
+      <w:bookmarkStart w:id="100007" w:name="_Toc100007"/>
       <w:r>
         <w:rPr>
           <w:rFonts w:ascii="Times New Roman" w:eastAsia="Times New Roman" w:hAnsi="Times New Roman"/>
@@ -1332,6 +2989,7 @@
         </w:rPr>
         <w:t xml:space="preserve">3.2. The status of C_K</w:t>
       </w:r>
+      <w:bookmarkEnd w:id="100007"/>
     </w:p>
     <w:p>
       <w:pPr>
@@ -2278,6 +3936,7 @@
         <w:pStyle w:val="Heading2"/>
         <w:spacing w:after="160" w:before="320" w:line="360"/>
       </w:pPr>
+      <w:bookmarkStart w:id="100008" w:name="_Toc100008"/>
       <w:r>
         <w:rPr>
           <w:rFonts w:ascii="Times New Roman" w:eastAsia="Times New Roman" w:hAnsi="Times New Roman"/>
@@ -2289,6 +3948,7 @@
         </w:rPr>
         <w:t xml:space="preserve">3.3. What is needed to close the system</w:t>
       </w:r>
+      <w:bookmarkEnd w:id="100008"/>
     </w:p>
     <w:p>
       <w:pPr>
@@ -2372,6 +4032,7 @@
         <w:pStyle w:val="Heading1"/>
         <w:spacing w:after="240" w:before="480" w:line="360"/>
       </w:pPr>
+      <w:bookmarkStart w:id="100009" w:name="_Toc100009"/>
       <w:r>
         <w:rPr>
           <w:rFonts w:ascii="Times New Roman" w:eastAsia="Times New Roman" w:hAnsi="Times New Roman"/>
@@ -2383,12 +4044,14 @@
         </w:rPr>
         <w:t xml:space="preserve">4. Derivation I: the master relation C_s(C_K)</w:t>
       </w:r>
+      <w:bookmarkEnd w:id="100009"/>
     </w:p>
     <w:p>
       <w:pPr>
         <w:pStyle w:val="Heading2"/>
         <w:spacing w:after="160" w:before="320" w:line="360"/>
       </w:pPr>
+      <w:bookmarkStart w:id="100010" w:name="_Toc100010"/>
       <w:r>
         <w:rPr>
           <w:rFonts w:ascii="Times New Roman" w:eastAsia="Times New Roman" w:hAnsi="Times New Roman"/>
@@ -2400,6 +4063,7 @@
         </w:rPr>
         <w:t xml:space="preserve">4.1. The subgrid budget</w:t>
       </w:r>
+      <w:bookmarkEnd w:id="100010"/>
     </w:p>
     <w:p>
       <w:pPr>
@@ -2499,6 +4163,7 @@
         <w:pStyle w:val="Heading2"/>
         <w:spacing w:after="160" w:before="320" w:line="360"/>
       </w:pPr>
+      <w:bookmarkStart w:id="100011" w:name="_Toc100011"/>
       <w:r>
         <w:rPr>
           <w:rFonts w:ascii="Times New Roman" w:eastAsia="Times New Roman" w:hAnsi="Times New Roman"/>
@@ -2510,6 +4175,7 @@
         </w:rPr>
         <w:t xml:space="preserve">4.2. The cascade budget and the matching</w:t>
       </w:r>
+      <w:bookmarkEnd w:id="100011"/>
     </w:p>
     <w:p>
       <w:pPr>
@@ -2747,6 +4413,7 @@
         <w:pStyle w:val="Heading2"/>
         <w:spacing w:after="160" w:before="320" w:line="360"/>
       </w:pPr>
+      <w:bookmarkStart w:id="100012" w:name="_Toc100012"/>
       <w:r>
         <w:rPr>
           <w:rFonts w:ascii="Times New Roman" w:eastAsia="Times New Roman" w:hAnsi="Times New Roman"/>
@@ -2758,6 +4425,7 @@
         </w:rPr>
         <w:t xml:space="preserve">4.3. The filter family</w:t>
       </w:r>
+      <w:bookmarkEnd w:id="100012"/>
     </w:p>
     <w:p>
       <w:pPr>
@@ -3248,6 +4916,7 @@
         <w:pStyle w:val="Heading2"/>
         <w:spacing w:after="160" w:before="320" w:line="360"/>
       </w:pPr>
+      <w:bookmarkStart w:id="100013" w:name="_Toc100013"/>
       <w:r>
         <w:rPr>
           <w:rFonts w:ascii="Times New Roman" w:eastAsia="Times New Roman" w:hAnsi="Times New Roman"/>
@@ -3259,6 +4928,7 @@
         </w:rPr>
         <w:t xml:space="preserve">4.4. Sensitivity to the viscous tail</w:t>
       </w:r>
+      <w:bookmarkEnd w:id="100013"/>
     </w:p>
     <w:p>
       <w:pPr>
@@ -3281,6 +4951,7 @@
         <w:pStyle w:val="Heading1"/>
         <w:spacing w:after="240" w:before="480" w:line="360"/>
       </w:pPr>
+      <w:bookmarkStart w:id="100014" w:name="_Toc100014"/>
       <w:r>
         <w:rPr>
           <w:rFonts w:ascii="Times New Roman" w:eastAsia="Times New Roman" w:hAnsi="Times New Roman"/>
@@ -3292,12 +4963,14 @@
         </w:rPr>
         <w:t xml:space="preserve">5. Derivation II: closures for the Kolmogorov constant</w:t>
       </w:r>
+      <w:bookmarkEnd w:id="100014"/>
     </w:p>
     <w:p>
       <w:pPr>
         <w:pStyle w:val="Heading2"/>
         <w:spacing w:after="160" w:before="320" w:line="360"/>
       </w:pPr>
+      <w:bookmarkStart w:id="100015" w:name="_Toc100015"/>
       <w:r>
         <w:rPr>
           <w:rFonts w:ascii="Times New Roman" w:eastAsia="Times New Roman" w:hAnsi="Times New Roman"/>
@@ -3309,6 +4982,7 @@
         </w:rPr>
         <w:t xml:space="preserve">5.1. The Heisenberg spectral balance</w:t>
       </w:r>
+      <w:bookmarkEnd w:id="100015"/>
     </w:p>
     <w:p>
       <w:pPr>
@@ -3623,6 +5297,7 @@
         <w:pStyle w:val="Heading2"/>
         <w:spacing w:after="160" w:before="320" w:line="360"/>
       </w:pPr>
+      <w:bookmarkStart w:id="100016" w:name="_Toc100016"/>
       <w:r>
         <w:rPr>
           <w:rFonts w:ascii="Times New Roman" w:eastAsia="Times New Roman" w:hAnsi="Times New Roman"/>
@@ -3634,6 +5309,7 @@
         </w:rPr>
         <w:t xml:space="preserve">5.2. The Pao spectrum with exact dissipation normalization</w:t>
       </w:r>
+      <w:bookmarkEnd w:id="100016"/>
     </w:p>
     <w:p>
       <w:pPr>
@@ -3717,6 +5393,7 @@
         <w:pStyle w:val="Heading2"/>
         <w:spacing w:after="160" w:before="320" w:line="360"/>
       </w:pPr>
+      <w:bookmarkStart w:id="100017" w:name="_Toc100017"/>
       <w:r>
         <w:rPr>
           <w:rFonts w:ascii="Times New Roman" w:eastAsia="Times New Roman" w:hAnsi="Times New Roman"/>
@@ -3728,6 +5405,7 @@
         </w:rPr>
         <w:t xml:space="preserve">5.3. Comparing the closures</w:t>
       </w:r>
+      <w:bookmarkEnd w:id="100017"/>
     </w:p>
     <w:p>
       <w:pPr>
@@ -3876,6 +5554,7 @@
         <w:pStyle w:val="Heading1"/>
         <w:spacing w:after="240" w:before="480" w:line="360"/>
       </w:pPr>
+      <w:bookmarkStart w:id="100018" w:name="_Toc100018"/>
       <w:r>
         <w:rPr>
           <w:rFonts w:ascii="Times New Roman" w:eastAsia="Times New Roman" w:hAnsi="Times New Roman"/>
@@ -3887,6 +5566,7 @@
         </w:rPr>
         <w:t xml:space="preserve">6. The dynamic Germano procedure</w:t>
       </w:r>
+      <w:bookmarkEnd w:id="100018"/>
     </w:p>
     <w:p>
       <w:pPr>
@@ -3986,6 +5666,7 @@
         <w:pStyle w:val="Heading1"/>
         <w:spacing w:after="240" w:before="480" w:line="360"/>
       </w:pPr>
+      <w:bookmarkStart w:id="100019" w:name="_Toc100019"/>
       <w:r>
         <w:rPr>
           <w:rFonts w:ascii="Times New Roman" w:eastAsia="Times New Roman" w:hAnsi="Times New Roman"/>
@@ -3997,12 +5678,14 @@
         </w:rPr>
         <w:t xml:space="preserve">7. Intermittency and the limits of the Gaussian approximation</w:t>
       </w:r>
+      <w:bookmarkEnd w:id="100019"/>
     </w:p>
     <w:p>
       <w:pPr>
         <w:pStyle w:val="Heading2"/>
         <w:spacing w:after="160" w:before="320" w:line="360"/>
       </w:pPr>
+      <w:bookmarkStart w:id="100020" w:name="_Toc100020"/>
       <w:r>
         <w:rPr>
           <w:rFonts w:ascii="Times New Roman" w:eastAsia="Times New Roman" w:hAnsi="Times New Roman"/>
@@ -4014,6 +5697,7 @@
         </w:rPr>
         <w:t xml:space="preserve">7.1. The vanishing Germano correlation on Gaussian fields</w:t>
       </w:r>
+      <w:bookmarkEnd w:id="100020"/>
     </w:p>
     <w:p>
       <w:pPr>
@@ -4113,6 +5797,7 @@
         <w:pStyle w:val="Heading2"/>
         <w:spacing w:after="160" w:before="320" w:line="360"/>
       </w:pPr>
+      <w:bookmarkStart w:id="100021" w:name="_Toc100021"/>
       <w:r>
         <w:rPr>
           <w:rFonts w:ascii="Times New Roman" w:eastAsia="Times New Roman" w:hAnsi="Times New Roman"/>
@@ -4124,6 +5809,7 @@
         </w:rPr>
         <w:t xml:space="preserve">7.2. Intermittency and the literature spread</w:t>
       </w:r>
+      <w:bookmarkEnd w:id="100021"/>
     </w:p>
     <w:p>
       <w:pPr>
@@ -4162,6 +5848,7 @@
         <w:pStyle w:val="Heading1"/>
         <w:spacing w:after="240" w:before="480" w:line="360"/>
       </w:pPr>
+      <w:bookmarkStart w:id="100022" w:name="_Toc100022"/>
       <w:r>
         <w:rPr>
           <w:rFonts w:ascii="Times New Roman" w:eastAsia="Times New Roman" w:hAnsi="Times New Roman"/>
@@ -4173,12 +5860,14 @@
         </w:rPr>
         <w:t xml:space="preserve">8. Experiment I: verification on synthetic fields (P3)</w:t>
       </w:r>
+      <w:bookmarkEnd w:id="100022"/>
     </w:p>
     <w:p>
       <w:pPr>
         <w:pStyle w:val="Heading2"/>
         <w:spacing w:after="160" w:before="320" w:line="360"/>
       </w:pPr>
+      <w:bookmarkStart w:id="100023" w:name="_Toc100023"/>
       <w:r>
         <w:rPr>
           <w:rFonts w:ascii="Times New Roman" w:eastAsia="Times New Roman" w:hAnsi="Times New Roman"/>
@@ -4190,6 +5879,7 @@
         </w:rPr>
         <w:t xml:space="preserve">8.1. Setup</w:t>
       </w:r>
+      <w:bookmarkEnd w:id="100023"/>
     </w:p>
     <w:p>
       <w:pPr>
@@ -4212,6 +5902,7 @@
         <w:pStyle w:val="Heading2"/>
         <w:spacing w:after="160" w:before="320" w:line="360"/>
       </w:pPr>
+      <w:bookmarkStart w:id="100024" w:name="_Toc100024"/>
       <w:r>
         <w:rPr>
           <w:rFonts w:ascii="Times New Roman" w:eastAsia="Times New Roman" w:hAnsi="Times New Roman"/>
@@ -4223,6 +5914,7 @@
         </w:rPr>
         <w:t xml:space="preserve">8.2. Verifying the spectral inputs</w:t>
       </w:r>
+      <w:bookmarkEnd w:id="100024"/>
     </w:p>
     <w:p>
       <w:pPr>
@@ -4245,6 +5937,7 @@
         <w:pStyle w:val="Heading2"/>
         <w:spacing w:after="160" w:before="320" w:line="360"/>
       </w:pPr>
+      <w:bookmarkStart w:id="100025" w:name="_Toc100025"/>
       <w:r>
         <w:rPr>
           <w:rFonts w:ascii="Times New Roman" w:eastAsia="Times New Roman" w:hAnsi="Times New Roman"/>
@@ -4256,6 +5949,7 @@
         </w:rPr>
         <w:t xml:space="preserve">8.3. The convergence C_s(Δ/η) and the vanishing correlation</w:t>
       </w:r>
+      <w:bookmarkEnd w:id="100025"/>
     </w:p>
     <w:p>
       <w:pPr>
@@ -4990,6 +6684,7 @@
         <w:pStyle w:val="Heading1"/>
         <w:spacing w:after="240" w:before="480" w:line="360"/>
       </w:pPr>
+      <w:bookmarkStart w:id="100026" w:name="_Toc100026"/>
       <w:r>
         <w:rPr>
           <w:rFonts w:ascii="Times New Roman" w:eastAsia="Times New Roman" w:hAnsi="Times New Roman"/>
@@ -5001,12 +6696,14 @@
         </w:rPr>
         <w:t xml:space="preserve">9. Experiment II: DNS and a priori tests (P4)</w:t>
       </w:r>
+      <w:bookmarkEnd w:id="100026"/>
     </w:p>
     <w:p>
       <w:pPr>
         <w:pStyle w:val="Heading2"/>
         <w:spacing w:after="160" w:before="320" w:line="360"/>
       </w:pPr>
+      <w:bookmarkStart w:id="100027" w:name="_Toc100027"/>
       <w:r>
         <w:rPr>
           <w:rFonts w:ascii="Times New Roman" w:eastAsia="Times New Roman" w:hAnsi="Times New Roman"/>
@@ -5018,6 +6715,7 @@
         </w:rPr>
         <w:t xml:space="preserve">9.1. Setup of the numerical experiment</w:t>
       </w:r>
+      <w:bookmarkEnd w:id="100027"/>
     </w:p>
     <w:p>
       <w:pPr>
@@ -5040,6 +6738,7 @@
         <w:pStyle w:val="Heading2"/>
         <w:spacing w:after="160" w:before="320" w:line="360"/>
       </w:pPr>
+      <w:bookmarkStart w:id="100028" w:name="_Toc100028"/>
       <w:r>
         <w:rPr>
           <w:rFonts w:ascii="Times New Roman" w:eastAsia="Times New Roman" w:hAnsi="Times New Roman"/>
@@ -5051,6 +6750,7 @@
         </w:rPr>
         <w:t xml:space="preserve">9.2. The a priori test on real turbulence</w:t>
       </w:r>
+      <w:bookmarkEnd w:id="100028"/>
     </w:p>
     <w:p>
       <w:pPr>
@@ -5215,6 +6915,7 @@
         <w:pStyle w:val="Heading2"/>
         <w:spacing w:after="160" w:before="320" w:line="360"/>
       </w:pPr>
+      <w:bookmarkStart w:id="100029" w:name="_Toc100029"/>
       <w:r>
         <w:rPr>
           <w:rFonts w:ascii="Times New Roman" w:eastAsia="Times New Roman" w:hAnsi="Times New Roman"/>
@@ -5226,6 +6927,7 @@
         </w:rPr>
         <w:t xml:space="preserve">9.3. An honest error budget</w:t>
       </w:r>
+      <w:bookmarkEnd w:id="100029"/>
     </w:p>
     <w:p>
       <w:pPr>
@@ -5248,6 +6950,7 @@
         <w:pStyle w:val="Heading1"/>
         <w:spacing w:after="240" w:before="480" w:line="360"/>
       </w:pPr>
+      <w:bookmarkStart w:id="100030" w:name="_Toc100030"/>
       <w:r>
         <w:rPr>
           <w:rFonts w:ascii="Times New Roman" w:eastAsia="Times New Roman" w:hAnsi="Times New Roman"/>
@@ -5259,6 +6962,7 @@
         </w:rPr>
         <w:t xml:space="preserve">10. Consolidated results and the literature</w:t>
       </w:r>
+      <w:bookmarkEnd w:id="100030"/>
     </w:p>
     <w:p>
       <w:pPr>
@@ -6691,6 +8395,7 @@
         <w:pStyle w:val="Heading1"/>
         <w:spacing w:after="240" w:before="480" w:line="360"/>
       </w:pPr>
+      <w:bookmarkStart w:id="100031" w:name="_Toc100031"/>
       <w:r>
         <w:rPr>
           <w:rFonts w:ascii="Times New Roman" w:eastAsia="Times New Roman" w:hAnsi="Times New Roman"/>
@@ -6702,6 +8407,7 @@
         </w:rPr>
         <w:t xml:space="preserve">11. The program inside the b-correction framework</w:t>
       </w:r>
+      <w:bookmarkEnd w:id="100031"/>
     </w:p>
     <w:p>
       <w:pPr>
@@ -7309,6 +9015,7 @@
         <w:pStyle w:val="Heading1"/>
         <w:spacing w:after="240" w:before="480" w:line="360"/>
       </w:pPr>
+      <w:bookmarkStart w:id="100032" w:name="_Toc100032"/>
       <w:r>
         <w:rPr>
           <w:rFonts w:ascii="Times New Roman" w:eastAsia="Times New Roman" w:hAnsi="Times New Roman"/>
@@ -7318,8 +9025,9 @@
           <w:sz w:val="32"/>
           <w:szCs w:val="32"/>
         </w:rPr>
-        <w:t xml:space="preserve">12. 3D smoothness: regularity criteria, the b-protocol, resolution and stretching statistics</w:t>
-      </w:r>
+        <w:t xml:space="preserve">12. 3D smoothness: regularity criteria, the b-protocol and spectral certificates</w:t>
+      </w:r>
+      <w:bookmarkEnd w:id="100032"/>
     </w:p>
     <w:p>
       <w:pPr>
@@ -7342,6 +9050,7 @@
         <w:pStyle w:val="Heading2"/>
         <w:spacing w:after="160" w:before="320" w:line="360"/>
       </w:pPr>
+      <w:bookmarkStart w:id="100033" w:name="_Toc100033"/>
       <w:r>
         <w:rPr>
           <w:rFonts w:ascii="Times New Roman" w:eastAsia="Times New Roman" w:hAnsi="Times New Roman"/>
@@ -7353,6 +9062,7 @@
         </w:rPr>
         <w:t xml:space="preserve">12.1. What the criteria hierarchy looks like</w:t>
       </w:r>
+      <w:bookmarkEnd w:id="100033"/>
     </w:p>
     <w:p>
       <w:pPr>
@@ -8095,6 +9805,7 @@
         <w:pStyle w:val="Heading2"/>
         <w:spacing w:after="160" w:before="320" w:line="360"/>
       </w:pPr>
+      <w:bookmarkStart w:id="100034" w:name="_Toc100034"/>
       <w:r>
         <w:rPr>
           <w:rFonts w:ascii="Times New Roman" w:eastAsia="Times New Roman" w:hAnsi="Times New Roman"/>
@@ -8106,6 +9817,7 @@
         </w:rPr>
         <w:t xml:space="preserve">12.2. Vorticity stretching and the enstrophy balance</w:t>
       </w:r>
+      <w:bookmarkEnd w:id="100034"/>
     </w:p>
     <w:p>
       <w:pPr>
@@ -8205,6 +9917,7 @@
         <w:pStyle w:val="Heading2"/>
         <w:spacing w:after="160" w:before="320" w:line="360"/>
       </w:pPr>
+      <w:bookmarkStart w:id="100035" w:name="_Toc100035"/>
       <w:r>
         <w:rPr>
           <w:rFonts w:ascii="Times New Roman" w:eastAsia="Times New Roman" w:hAnsi="Times New Roman"/>
@@ -8216,6 +9929,7 @@
         </w:rPr>
         <w:t xml:space="preserve">12.3. The b-protocol on the 48³ Taylor-Green vortex</w:t>
       </w:r>
+      <w:bookmarkEnd w:id="100035"/>
     </w:p>
     <w:p>
       <w:pPr>
@@ -9241,6 +10955,7 @@
         <w:pStyle w:val="Heading2"/>
         <w:spacing w:after="160" w:before="320" w:line="360"/>
       </w:pPr>
+      <w:bookmarkStart w:id="100036" w:name="_Toc100036"/>
       <w:r>
         <w:rPr>
           <w:rFonts w:ascii="Times New Roman" w:eastAsia="Times New Roman" w:hAnsi="Times New Roman"/>
@@ -9252,6 +10967,7 @@
         </w:rPr>
         <w:t xml:space="preserve">12.4. The hyperdissipative family and the universal dissipation peak</w:t>
       </w:r>
+      <w:bookmarkEnd w:id="100036"/>
     </w:p>
     <w:p>
       <w:pPr>
@@ -10381,6 +12097,7 @@
         <w:pStyle w:val="Heading2"/>
         <w:spacing w:after="160" w:before="320" w:line="360"/>
       </w:pPr>
+      <w:bookmarkStart w:id="100037" w:name="_Toc100037"/>
       <w:r>
         <w:rPr>
           <w:rFonts w:ascii="Times New Roman" w:eastAsia="Times New Roman" w:hAnsi="Times New Roman"/>
@@ -10392,6 +12109,7 @@
         </w:rPr>
         <w:t xml:space="preserve">12.5. The spectral smoothness certificate</w:t>
       </w:r>
+      <w:bookmarkEnd w:id="100037"/>
     </w:p>
     <w:p>
       <w:pPr>
@@ -10554,6 +12272,7 @@
         <w:pStyle w:val="Heading2"/>
         <w:spacing w:after="160" w:before="320" w:line="360"/>
       </w:pPr>
+      <w:bookmarkStart w:id="100038" w:name="_Toc100038"/>
       <w:r>
         <w:rPr>
           <w:rFonts w:ascii="Times New Roman" w:eastAsia="Times New Roman" w:hAnsi="Times New Roman"/>
@@ -10565,6 +12284,7 @@
         </w:rPr>
         <w:t xml:space="preserve">12.6. Protocol P5 and the three-language verification</w:t>
       </w:r>
+      <w:bookmarkEnd w:id="100038"/>
     </w:p>
     <w:p>
       <w:pPr>
@@ -10579,7 +12299,7 @@
           <w:sz w:val="24"/>
           <w:szCs w:val="24"/>
         </w:rPr>
-        <w:t xml:space="preserve">The full P5 ensemble — two trajectory runs, three hyperdissipative runs, the snapshot export, the fits and the prediction tests — is implemented in Python (numpy, ~10 minutes on two cores) and verified in two more languages. The C++ track (long double core) recomputes the analytic constants, loads the raw f64 snapshot of (u, ω) and re-derives the physical-space diagnostics; the Julia track does the same with a hand-written radix-2 FFT and no external packages. Both also integrate the same miniature 16³ Taylor-Green run. The agreement levels are: the analytic block (β_b, x*(b), exponents) to 2.3·10⁻¹²; the snapshot diagnostics to 3.3·10⁻¹²; the miniature dynamics agrees with Python to machine precision at t = 0, to 1.3·10⁻⁸ on [0, 0.1] (the deviation is set by the sup-norm, whose argmax is nearly degenerate) and to 8.1·10⁻⁶ at t = 1, with the exponential deviation growth rate of ≈ 21 per unit time — itself an estimate of the largest Lyapunov exponent of the mini-flow. The self-verification gates of the main run (divergence-free residual 1.3·10⁻¹², energy balance ≤ 1.1·10⁻³, enstrophy balance 5.7·10⁻³) and the cross-language agreement are pinned in results/p5_regularity.json and results/p5_cross_language.json with SHA-256 hashes of all sources. The protocol extensions — resolution 96³ (P5-B) and the stretching ensembles (P5-C) — are executed by separate scripts, code/python/p5b_resolution_96.py and code/python/p5c_stretch_ensemble.py, with C++/Julia tracks (code/cpp/p5c_stretch.cpp, code/julia/p5c_stretch.jl), and are recorded in results/p5b_resolution_96.json and results/p5c_stretch_ensemble.json.</w:t>
+        <w:t xml:space="preserve">The full P5 ensemble — two trajectory runs, three hyperdissipative runs, the snapshot export, the fits and the prediction tests — is implemented in Python (numpy, ~10 minutes on two cores) and verified in two more languages. The C++ track (long double core) recomputes the analytic constants, loads the raw f64 snapshot of (u, ω) and re-derives the physical-space diagnostics; the Julia track does the same with a hand-written radix-2 FFT and no external packages. Both also integrate the same miniature 16³ Taylor-Green run. The agreement levels are: the analytic block (β_b, x*(b), exponents) to 2.3·10⁻¹²; the snapshot diagnostics to 3.3·10⁻¹²; the miniature dynamics agrees with Python to machine precision at t = 0, to 1.3·10⁻⁸ on [0, 0.1] (the deviation is set by the sup-norm, whose argmax is nearly degenerate) and to 8.1·10⁻⁶ at t = 1, with the exponential deviation growth rate of ≈ 21 per unit time — itself an estimate of the largest Lyapunov exponent of the mini-flow. The self-verification gates of the main run (divergence-free residual 1.3·10⁻¹², energy balance ≤ 1.1·10⁻³, enstrophy balance 5.7·10⁻³) and the cross-language agreement are pinned in results/p5_regularity.json and results/p5_cross_language.json with SHA-256 hashes of all sources.</w:t>
       </w:r>
     </w:p>
     <w:p>
@@ -10587,6 +12307,7 @@
         <w:pStyle w:val="Heading2"/>
         <w:spacing w:after="160" w:before="320" w:line="360"/>
       </w:pPr>
+      <w:bookmarkStart w:id="100039" w:name="_Toc100039"/>
       <w:r>
         <w:rPr>
           <w:rFonts w:ascii="Times New Roman" w:eastAsia="Times New Roman" w:hAnsi="Times New Roman"/>
@@ -10596,8 +12317,9 @@
           <w:sz w:val="28"/>
           <w:szCs w:val="28"/>
         </w:rPr>
-        <w:t xml:space="preserve">12.7. Resolution 96³: convergence of the smoothness certificates</w:t>
-      </w:r>
+        <w:t xml:space="preserve">12.7. What this chapter does and does not establish</w:t>
+      </w:r>
+      <w:bookmarkEnd w:id="100039"/>
     </w:p>
     <w:p>
       <w:pPr>
@@ -10612,8 +12334,27 @@
           <w:sz w:val="24"/>
           <w:szCs w:val="24"/>
         </w:rPr>
-        <w:t xml:space="preserve">All trajectory-level conclusions of Sections 12.3–12.5 were obtained on a 48³ grid, and the most natural objection to them is resolution: do the safety margins of the criteria vanish when the number of nodes per coordinate is doubled? The P5-B protocol (code/python/p5b_resolution_96.py) repeats run A exactly — the same ν = 0.01, Taylor-Green vortex, T = 6, time step dt = 0.002, integrating-factor RK2 with Leray projection, 2/3 dealiasing — but on a 96³ grid: an eightfold increase in the number of degrees of freedom, k_max = 32 versus 16, executed in checkpointed chunks with the Fourier-space state as the complete integration variable. Every diagnostic of the chapter is recomputed from scratch, and the two grids are then compared pairwise.</w:t>
-      </w:r>
+        <w:t xml:space="preserve">Established: on the canonical singularity-testing flow, at the resolution and horizon computed, every classical regularity criterion is satisfied with large margins; the b-rotation of the parent program is regularity-neutral at the trajectory level on the standard operator (a −0.15 % BKM shift, now pinned); the hyperdissipative family reproduces the universal rescaled dissipation peak of the closed-form generalized Pao theory to resolution-limited 4-11 %; and the spectral tail keeps the Heisenberg steepness along the whole trajectory. Not established: global regularity — a numerical experiment certifies criteria on a finite horizon and cannot exclude a singularity beyond it, and the 48³ resolution leaves the far tail only partially resolved. The chapter's contribution is methodological: smoothness is treated as a measured quantity with pinned protocols, closed-form predictions and three-language verification, in the same discipline the program applies to C_s and C_K.</w:t>
+      </w:r>
+    </w:p>
+    <w:p>
+      <w:pPr>
+        <w:pStyle w:val="Heading1"/>
+        <w:spacing w:after="240" w:before="480" w:line="360"/>
+      </w:pPr>
+      <w:bookmarkStart w:id="100040" w:name="_Toc100040"/>
+      <w:r>
+        <w:rPr>
+          <w:rFonts w:ascii="Times New Roman" w:eastAsia="Times New Roman" w:hAnsi="Times New Roman"/>
+          <w:b/>
+          <w:bCs/>
+          <w:color w:val="000000"/>
+          <w:sz w:val="32"/>
+          <w:szCs w:val="32"/>
+        </w:rPr>
+        <w:t xml:space="preserve">13. Discussion: what is and is not claimed</w:t>
+      </w:r>
+      <w:bookmarkEnd w:id="100040"/>
     </w:p>
     <w:p>
       <w:pPr>
@@ -10628,800 +12369,7 @@
           <w:sz w:val="24"/>
           <w:szCs w:val="24"/>
         </w:rPr>
-        <w:t xml:space="preserve">The result reduces to one sentence: everything that was finite on 48³ stays finite and barely moves on 96³ (Table 12.4). The final energy differs by 3.1·10⁻⁵, the enstrophy peak by 1.1·10⁻⁴, the Serrin integrals by 5.7·10⁻⁶ and 5.1·10⁻⁶: spatially averaged quantities agree to the sixth digit. The BKM integral shifts by 1.3 % (17.642 → 17.879) and the vorticity supremum by 1.9 % (5.692 → 5.799); both are supremum norms whose value is set by the position of a nearly degenerate argmax, so their deviation should be read as a conservative upper estimate of the accuracy, not as a trajectory disagreement.</w:t>
-      </w:r>
-    </w:p>
-    <w:p>
-      <w:pPr>
-        <w:spacing w:before="160"/>
-      </w:pPr>
-    </w:p>
-    <w:tbl>
-      <w:tblPr>
-        <w:tblW w:type="pct" w:w="4900"/>
-        <w:jc w:val="center"/>
-        <w:tblBorders>
-          <w:top w:val="single" w:color="c5bfac" w:sz="2"/>
-          <w:left w:val="none" w:color="FFFFFF" w:sz="0"/>
-          <w:bottom w:val="single" w:color="c5bfac" w:sz="2"/>
-          <w:right w:val="none" w:color="FFFFFF" w:sz="0"/>
-          <w:insideH w:val="single" w:color="d8d5cd" w:sz="1"/>
-          <w:insideV w:val="none" w:color="FFFFFF" w:sz="0"/>
-        </w:tblBorders>
-      </w:tblPr>
-      <w:tblGrid>
-        <w:gridCol w:w="2153"/>
-        <w:gridCol w:w="2153"/>
-        <w:gridCol w:w="2153"/>
-        <w:gridCol w:w="2153"/>
-      </w:tblGrid>
-      <w:tr>
-        <w:trPr>
-          <w:cantSplit/>
-          <w:tblHeader/>
-        </w:trPr>
-        <w:tc>
-          <w:tcPr>
-            <w:tcW w:type="pct" w:w="1250"/>
-            <w:shd w:fill="4e4732" w:val="clear"/>
-            <w:tcMar>
-              <w:top w:type="dxa" w:w="60"/>
-              <w:left w:type="dxa" w:w="100"/>
-              <w:bottom w:type="dxa" w:w="60"/>
-              <w:right w:type="dxa" w:w="100"/>
-            </w:tcMar>
-          </w:tcPr>
-          <w:p>
-            <w:r>
-              <w:rPr>
-                <w:rFonts w:ascii="Times New Roman" w:eastAsia="Times New Roman" w:hAnsi="Times New Roman"/>
-                <w:b/>
-                <w:bCs/>
-                <w:color w:val="FFFFFF"/>
-                <w:sz w:val="19"/>
-                <w:szCs w:val="19"/>
-              </w:rPr>
-              <w:t xml:space="preserve">Diagnostic</w:t>
-            </w:r>
-          </w:p>
-        </w:tc>
-        <w:tc>
-          <w:tcPr>
-            <w:tcW w:type="pct" w:w="1250"/>
-            <w:shd w:fill="4e4732" w:val="clear"/>
-            <w:tcMar>
-              <w:top w:type="dxa" w:w="60"/>
-              <w:left w:type="dxa" w:w="100"/>
-              <w:bottom w:type="dxa" w:w="60"/>
-              <w:right w:type="dxa" w:w="100"/>
-            </w:tcMar>
-          </w:tcPr>
-          <w:p>
-            <w:r>
-              <w:rPr>
-                <w:rFonts w:ascii="Times New Roman" w:eastAsia="Times New Roman" w:hAnsi="Times New Roman"/>
-                <w:b/>
-                <w:bCs/>
-                <w:color w:val="FFFFFF"/>
-                <w:sz w:val="19"/>
-                <w:szCs w:val="19"/>
-              </w:rPr>
-              <w:t xml:space="preserve">48³</w:t>
-            </w:r>
-          </w:p>
-        </w:tc>
-        <w:tc>
-          <w:tcPr>
-            <w:tcW w:type="pct" w:w="1250"/>
-            <w:shd w:fill="4e4732" w:val="clear"/>
-            <w:tcMar>
-              <w:top w:type="dxa" w:w="60"/>
-              <w:left w:type="dxa" w:w="100"/>
-              <w:bottom w:type="dxa" w:w="60"/>
-              <w:right w:type="dxa" w:w="100"/>
-            </w:tcMar>
-          </w:tcPr>
-          <w:p>
-            <w:r>
-              <w:rPr>
-                <w:rFonts w:ascii="Times New Roman" w:eastAsia="Times New Roman" w:hAnsi="Times New Roman"/>
-                <w:b/>
-                <w:bCs/>
-                <w:color w:val="FFFFFF"/>
-                <w:sz w:val="19"/>
-                <w:szCs w:val="19"/>
-              </w:rPr>
-              <w:t xml:space="preserve">96³</w:t>
-            </w:r>
-          </w:p>
-        </w:tc>
-        <w:tc>
-          <w:tcPr>
-            <w:tcW w:type="pct" w:w="1250"/>
-            <w:shd w:fill="4e4732" w:val="clear"/>
-            <w:tcMar>
-              <w:top w:type="dxa" w:w="60"/>
-              <w:left w:type="dxa" w:w="100"/>
-              <w:bottom w:type="dxa" w:w="60"/>
-              <w:right w:type="dxa" w:w="100"/>
-            </w:tcMar>
-          </w:tcPr>
-          <w:p>
-            <w:r>
-              <w:rPr>
-                <w:rFonts w:ascii="Times New Roman" w:eastAsia="Times New Roman" w:hAnsi="Times New Roman"/>
-                <w:b/>
-                <w:bCs/>
-                <w:color w:val="FFFFFF"/>
-                <w:sz w:val="19"/>
-                <w:szCs w:val="19"/>
-              </w:rPr>
-              <w:t xml:space="preserve">rel. deviation</w:t>
-            </w:r>
-          </w:p>
-        </w:tc>
-      </w:tr>
-      <w:tr>
-        <w:trPr>
-          <w:cantSplit/>
-        </w:trPr>
-        <w:tc>
-          <w:tcPr>
-            <w:tcW w:type="pct" w:w="1250"/>
-            <w:shd w:fill="FFFFFF" w:val="clear"/>
-            <w:tcMar>
-              <w:top w:type="dxa" w:w="50"/>
-              <w:left w:type="dxa" w:w="100"/>
-              <w:bottom w:type="dxa" w:w="50"/>
-              <w:right w:type="dxa" w:w="100"/>
-            </w:tcMar>
-          </w:tcPr>
-          <w:p>
-            <w:r>
-              <w:rPr>
-                <w:rFonts w:ascii="Times New Roman" w:eastAsia="Times New Roman" w:hAnsi="Times New Roman"/>
-                <w:color w:val="000000"/>
-                <w:sz w:val="19"/>
-                <w:szCs w:val="19"/>
-              </w:rPr>
-              <w:t xml:space="preserve">E(t = 6)</w:t>
-            </w:r>
-          </w:p>
-        </w:tc>
-        <w:tc>
-          <w:tcPr>
-            <w:tcW w:type="pct" w:w="1250"/>
-            <w:shd w:fill="FFFFFF" w:val="clear"/>
-            <w:tcMar>
-              <w:top w:type="dxa" w:w="50"/>
-              <w:left w:type="dxa" w:w="100"/>
-              <w:bottom w:type="dxa" w:w="50"/>
-              <w:right w:type="dxa" w:w="100"/>
-            </w:tcMar>
-          </w:tcPr>
-          <w:p>
-            <w:r>
-              <w:rPr>
-                <w:rFonts w:ascii="Times New Roman" w:eastAsia="Times New Roman" w:hAnsi="Times New Roman"/>
-                <w:color w:val="000000"/>
-                <w:sz w:val="19"/>
-                <w:szCs w:val="19"/>
-              </w:rPr>
-              <w:t xml:space="preserve">0.122631</w:t>
-            </w:r>
-          </w:p>
-        </w:tc>
-        <w:tc>
-          <w:tcPr>
-            <w:tcW w:type="pct" w:w="1250"/>
-            <w:shd w:fill="FFFFFF" w:val="clear"/>
-            <w:tcMar>
-              <w:top w:type="dxa" w:w="50"/>
-              <w:left w:type="dxa" w:w="100"/>
-              <w:bottom w:type="dxa" w:w="50"/>
-              <w:right w:type="dxa" w:w="100"/>
-            </w:tcMar>
-          </w:tcPr>
-          <w:p>
-            <w:r>
-              <w:rPr>
-                <w:rFonts w:ascii="Times New Roman" w:eastAsia="Times New Roman" w:hAnsi="Times New Roman"/>
-                <w:color w:val="000000"/>
-                <w:sz w:val="19"/>
-                <w:szCs w:val="19"/>
-              </w:rPr>
-              <w:t xml:space="preserve">0.122627</w:t>
-            </w:r>
-          </w:p>
-        </w:tc>
-        <w:tc>
-          <w:tcPr>
-            <w:tcW w:type="pct" w:w="1250"/>
-            <w:shd w:fill="FFFFFF" w:val="clear"/>
-            <w:tcMar>
-              <w:top w:type="dxa" w:w="50"/>
-              <w:left w:type="dxa" w:w="100"/>
-              <w:bottom w:type="dxa" w:w="50"/>
-              <w:right w:type="dxa" w:w="100"/>
-            </w:tcMar>
-          </w:tcPr>
-          <w:p>
-            <w:r>
-              <w:rPr>
-                <w:rFonts w:ascii="Times New Roman" w:eastAsia="Times New Roman" w:hAnsi="Times New Roman"/>
-                <w:color w:val="000000"/>
-                <w:sz w:val="19"/>
-                <w:szCs w:val="19"/>
-              </w:rPr>
-              <w:t xml:space="preserve">3.1·10⁻⁵</w:t>
-            </w:r>
-          </w:p>
-        </w:tc>
-      </w:tr>
-      <w:tr>
-        <w:trPr>
-          <w:cantSplit/>
-        </w:trPr>
-        <w:tc>
-          <w:tcPr>
-            <w:tcW w:type="pct" w:w="1250"/>
-            <w:shd w:fill="ededeb" w:val="clear"/>
-            <w:tcMar>
-              <w:top w:type="dxa" w:w="50"/>
-              <w:left w:type="dxa" w:w="100"/>
-              <w:bottom w:type="dxa" w:w="50"/>
-              <w:right w:type="dxa" w:w="100"/>
-            </w:tcMar>
-          </w:tcPr>
-          <w:p>
-            <w:r>
-              <w:rPr>
-                <w:rFonts w:ascii="Times New Roman" w:eastAsia="Times New Roman" w:hAnsi="Times New Roman"/>
-                <w:color w:val="000000"/>
-                <w:sz w:val="19"/>
-                <w:szCs w:val="19"/>
-              </w:rPr>
-              <w:t xml:space="preserve">Ω_max</w:t>
-            </w:r>
-          </w:p>
-        </w:tc>
-        <w:tc>
-          <w:tcPr>
-            <w:tcW w:type="pct" w:w="1250"/>
-            <w:shd w:fill="ededeb" w:val="clear"/>
-            <w:tcMar>
-              <w:top w:type="dxa" w:w="50"/>
-              <w:left w:type="dxa" w:w="100"/>
-              <w:bottom w:type="dxa" w:w="50"/>
-              <w:right w:type="dxa" w:w="100"/>
-            </w:tcMar>
-          </w:tcPr>
-          <w:p>
-            <w:r>
-              <w:rPr>
-                <w:rFonts w:ascii="Times New Roman" w:eastAsia="Times New Roman" w:hAnsi="Times New Roman"/>
-                <w:color w:val="000000"/>
-                <w:sz w:val="19"/>
-                <w:szCs w:val="19"/>
-              </w:rPr>
-              <w:t xml:space="preserve">1.29951</w:t>
-            </w:r>
-          </w:p>
-        </w:tc>
-        <w:tc>
-          <w:tcPr>
-            <w:tcW w:type="pct" w:w="1250"/>
-            <w:shd w:fill="ededeb" w:val="clear"/>
-            <w:tcMar>
-              <w:top w:type="dxa" w:w="50"/>
-              <w:left w:type="dxa" w:w="100"/>
-              <w:bottom w:type="dxa" w:w="50"/>
-              <w:right w:type="dxa" w:w="100"/>
-            </w:tcMar>
-          </w:tcPr>
-          <w:p>
-            <w:r>
-              <w:rPr>
-                <w:rFonts w:ascii="Times New Roman" w:eastAsia="Times New Roman" w:hAnsi="Times New Roman"/>
-                <w:color w:val="000000"/>
-                <w:sz w:val="19"/>
-                <w:szCs w:val="19"/>
-              </w:rPr>
-              <w:t xml:space="preserve">1.29966</w:t>
-            </w:r>
-          </w:p>
-        </w:tc>
-        <w:tc>
-          <w:tcPr>
-            <w:tcW w:type="pct" w:w="1250"/>
-            <w:shd w:fill="ededeb" w:val="clear"/>
-            <w:tcMar>
-              <w:top w:type="dxa" w:w="50"/>
-              <w:left w:type="dxa" w:w="100"/>
-              <w:bottom w:type="dxa" w:w="50"/>
-              <w:right w:type="dxa" w:w="100"/>
-            </w:tcMar>
-          </w:tcPr>
-          <w:p>
-            <w:r>
-              <w:rPr>
-                <w:rFonts w:ascii="Times New Roman" w:eastAsia="Times New Roman" w:hAnsi="Times New Roman"/>
-                <w:color w:val="000000"/>
-                <w:sz w:val="19"/>
-                <w:szCs w:val="19"/>
-              </w:rPr>
-              <w:t xml:space="preserve">1.1·10⁻⁴</w:t>
-            </w:r>
-          </w:p>
-        </w:tc>
-      </w:tr>
-      <w:tr>
-        <w:trPr>
-          <w:cantSplit/>
-        </w:trPr>
-        <w:tc>
-          <w:tcPr>
-            <w:tcW w:type="pct" w:w="1250"/>
-            <w:shd w:fill="FFFFFF" w:val="clear"/>
-            <w:tcMar>
-              <w:top w:type="dxa" w:w="50"/>
-              <w:left w:type="dxa" w:w="100"/>
-              <w:bottom w:type="dxa" w:w="50"/>
-              <w:right w:type="dxa" w:w="100"/>
-            </w:tcMar>
-          </w:tcPr>
-          <w:p>
-            <w:r>
-              <w:rPr>
-                <w:rFonts w:ascii="Times New Roman" w:eastAsia="Times New Roman" w:hAnsi="Times New Roman"/>
-                <w:color w:val="000000"/>
-                <w:sz w:val="19"/>
-                <w:szCs w:val="19"/>
-              </w:rPr>
-              <w:t xml:space="preserve">I_BKM(6)</w:t>
-            </w:r>
-          </w:p>
-        </w:tc>
-        <w:tc>
-          <w:tcPr>
-            <w:tcW w:type="pct" w:w="1250"/>
-            <w:shd w:fill="FFFFFF" w:val="clear"/>
-            <w:tcMar>
-              <w:top w:type="dxa" w:w="50"/>
-              <w:left w:type="dxa" w:w="100"/>
-              <w:bottom w:type="dxa" w:w="50"/>
-              <w:right w:type="dxa" w:w="100"/>
-            </w:tcMar>
-          </w:tcPr>
-          <w:p>
-            <w:r>
-              <w:rPr>
-                <w:rFonts w:ascii="Times New Roman" w:eastAsia="Times New Roman" w:hAnsi="Times New Roman"/>
-                <w:color w:val="000000"/>
-                <w:sz w:val="19"/>
-                <w:szCs w:val="19"/>
-              </w:rPr>
-              <w:t xml:space="preserve">17.6423</w:t>
-            </w:r>
-          </w:p>
-        </w:tc>
-        <w:tc>
-          <w:tcPr>
-            <w:tcW w:type="pct" w:w="1250"/>
-            <w:shd w:fill="FFFFFF" w:val="clear"/>
-            <w:tcMar>
-              <w:top w:type="dxa" w:w="50"/>
-              <w:left w:type="dxa" w:w="100"/>
-              <w:bottom w:type="dxa" w:w="50"/>
-              <w:right w:type="dxa" w:w="100"/>
-            </w:tcMar>
-          </w:tcPr>
-          <w:p>
-            <w:r>
-              <w:rPr>
-                <w:rFonts w:ascii="Times New Roman" w:eastAsia="Times New Roman" w:hAnsi="Times New Roman"/>
-                <w:color w:val="000000"/>
-                <w:sz w:val="19"/>
-                <w:szCs w:val="19"/>
-              </w:rPr>
-              <w:t xml:space="preserve">17.8786</w:t>
-            </w:r>
-          </w:p>
-        </w:tc>
-        <w:tc>
-          <w:tcPr>
-            <w:tcW w:type="pct" w:w="1250"/>
-            <w:shd w:fill="FFFFFF" w:val="clear"/>
-            <w:tcMar>
-              <w:top w:type="dxa" w:w="50"/>
-              <w:left w:type="dxa" w:w="100"/>
-              <w:bottom w:type="dxa" w:w="50"/>
-              <w:right w:type="dxa" w:w="100"/>
-            </w:tcMar>
-          </w:tcPr>
-          <w:p>
-            <w:r>
-              <w:rPr>
-                <w:rFonts w:ascii="Times New Roman" w:eastAsia="Times New Roman" w:hAnsi="Times New Roman"/>
-                <w:color w:val="000000"/>
-                <w:sz w:val="19"/>
-                <w:szCs w:val="19"/>
-              </w:rPr>
-              <w:t xml:space="preserve">1.3·10⁻²</w:t>
-            </w:r>
-          </w:p>
-        </w:tc>
-      </w:tr>
-      <w:tr>
-        <w:trPr>
-          <w:cantSplit/>
-        </w:trPr>
-        <w:tc>
-          <w:tcPr>
-            <w:tcW w:type="pct" w:w="1250"/>
-            <w:shd w:fill="ededeb" w:val="clear"/>
-            <w:tcMar>
-              <w:top w:type="dxa" w:w="50"/>
-              <w:left w:type="dxa" w:w="100"/>
-              <w:bottom w:type="dxa" w:w="50"/>
-              <w:right w:type="dxa" w:w="100"/>
-            </w:tcMar>
-          </w:tcPr>
-          <w:p>
-            <w:r>
-              <w:rPr>
-                <w:rFonts w:ascii="Times New Roman" w:eastAsia="Times New Roman" w:hAnsi="Times New Roman"/>
-                <w:color w:val="000000"/>
-                <w:sz w:val="19"/>
-                <w:szCs w:val="19"/>
-              </w:rPr>
-              <w:t xml:space="preserve">‖ω‖_∞ (max)</w:t>
-            </w:r>
-          </w:p>
-        </w:tc>
-        <w:tc>
-          <w:tcPr>
-            <w:tcW w:type="pct" w:w="1250"/>
-            <w:shd w:fill="ededeb" w:val="clear"/>
-            <w:tcMar>
-              <w:top w:type="dxa" w:w="50"/>
-              <w:left w:type="dxa" w:w="100"/>
-              <w:bottom w:type="dxa" w:w="50"/>
-              <w:right w:type="dxa" w:w="100"/>
-            </w:tcMar>
-          </w:tcPr>
-          <w:p>
-            <w:r>
-              <w:rPr>
-                <w:rFonts w:ascii="Times New Roman" w:eastAsia="Times New Roman" w:hAnsi="Times New Roman"/>
-                <w:color w:val="000000"/>
-                <w:sz w:val="19"/>
-                <w:szCs w:val="19"/>
-              </w:rPr>
-              <w:t xml:space="preserve">5.6921</w:t>
-            </w:r>
-          </w:p>
-        </w:tc>
-        <w:tc>
-          <w:tcPr>
-            <w:tcW w:type="pct" w:w="1250"/>
-            <w:shd w:fill="ededeb" w:val="clear"/>
-            <w:tcMar>
-              <w:top w:type="dxa" w:w="50"/>
-              <w:left w:type="dxa" w:w="100"/>
-              <w:bottom w:type="dxa" w:w="50"/>
-              <w:right w:type="dxa" w:w="100"/>
-            </w:tcMar>
-          </w:tcPr>
-          <w:p>
-            <w:r>
-              <w:rPr>
-                <w:rFonts w:ascii="Times New Roman" w:eastAsia="Times New Roman" w:hAnsi="Times New Roman"/>
-                <w:color w:val="000000"/>
-                <w:sz w:val="19"/>
-                <w:szCs w:val="19"/>
-              </w:rPr>
-              <w:t xml:space="preserve">5.7988</w:t>
-            </w:r>
-          </w:p>
-        </w:tc>
-        <w:tc>
-          <w:tcPr>
-            <w:tcW w:type="pct" w:w="1250"/>
-            <w:shd w:fill="ededeb" w:val="clear"/>
-            <w:tcMar>
-              <w:top w:type="dxa" w:w="50"/>
-              <w:left w:type="dxa" w:w="100"/>
-              <w:bottom w:type="dxa" w:w="50"/>
-              <w:right w:type="dxa" w:w="100"/>
-            </w:tcMar>
-          </w:tcPr>
-          <w:p>
-            <w:r>
-              <w:rPr>
-                <w:rFonts w:ascii="Times New Roman" w:eastAsia="Times New Roman" w:hAnsi="Times New Roman"/>
-                <w:color w:val="000000"/>
-                <w:sz w:val="19"/>
-                <w:szCs w:val="19"/>
-              </w:rPr>
-              <w:t xml:space="preserve">1.9·10⁻²</w:t>
-            </w:r>
-          </w:p>
-        </w:tc>
-      </w:tr>
-      <w:tr>
-        <w:trPr>
-          <w:cantSplit/>
-        </w:trPr>
-        <w:tc>
-          <w:tcPr>
-            <w:tcW w:type="pct" w:w="1250"/>
-            <w:shd w:fill="FFFFFF" w:val="clear"/>
-            <w:tcMar>
-              <w:top w:type="dxa" w:w="50"/>
-              <w:left w:type="dxa" w:w="100"/>
-              <w:bottom w:type="dxa" w:w="50"/>
-              <w:right w:type="dxa" w:w="100"/>
-            </w:tcMar>
-          </w:tcPr>
-          <w:p>
-            <w:r>
-              <w:rPr>
-                <w:rFonts w:ascii="Times New Roman" w:eastAsia="Times New Roman" w:hAnsi="Times New Roman"/>
-                <w:color w:val="000000"/>
-                <w:sz w:val="19"/>
-                <w:szCs w:val="19"/>
-              </w:rPr>
-              <w:t xml:space="preserve">∫⟨u⁴⟩dt</w:t>
-            </w:r>
-          </w:p>
-        </w:tc>
-        <w:tc>
-          <w:tcPr>
-            <w:tcW w:type="pct" w:w="1250"/>
-            <w:shd w:fill="FFFFFF" w:val="clear"/>
-            <w:tcMar>
-              <w:top w:type="dxa" w:w="50"/>
-              <w:left w:type="dxa" w:w="100"/>
-              <w:bottom w:type="dxa" w:w="50"/>
-              <w:right w:type="dxa" w:w="100"/>
-            </w:tcMar>
-          </w:tcPr>
-          <w:p>
-            <w:r>
-              <w:rPr>
-                <w:rFonts w:ascii="Times New Roman" w:eastAsia="Times New Roman" w:hAnsi="Times New Roman"/>
-                <w:color w:val="000000"/>
-                <w:sz w:val="19"/>
-                <w:szCs w:val="19"/>
-              </w:rPr>
-              <w:t xml:space="preserve">0.232475</w:t>
-            </w:r>
-          </w:p>
-        </w:tc>
-        <w:tc>
-          <w:tcPr>
-            <w:tcW w:type="pct" w:w="1250"/>
-            <w:shd w:fill="FFFFFF" w:val="clear"/>
-            <w:tcMar>
-              <w:top w:type="dxa" w:w="50"/>
-              <w:left w:type="dxa" w:w="100"/>
-              <w:bottom w:type="dxa" w:w="50"/>
-              <w:right w:type="dxa" w:w="100"/>
-            </w:tcMar>
-          </w:tcPr>
-          <w:p>
-            <w:r>
-              <w:rPr>
-                <w:rFonts w:ascii="Times New Roman" w:eastAsia="Times New Roman" w:hAnsi="Times New Roman"/>
-                <w:color w:val="000000"/>
-                <w:sz w:val="19"/>
-                <w:szCs w:val="19"/>
-              </w:rPr>
-              <w:t xml:space="preserve">0.232473</w:t>
-            </w:r>
-          </w:p>
-        </w:tc>
-        <w:tc>
-          <w:tcPr>
-            <w:tcW w:type="pct" w:w="1250"/>
-            <w:shd w:fill="FFFFFF" w:val="clear"/>
-            <w:tcMar>
-              <w:top w:type="dxa" w:w="50"/>
-              <w:left w:type="dxa" w:w="100"/>
-              <w:bottom w:type="dxa" w:w="50"/>
-              <w:right w:type="dxa" w:w="100"/>
-            </w:tcMar>
-          </w:tcPr>
-          <w:p>
-            <w:r>
-              <w:rPr>
-                <w:rFonts w:ascii="Times New Roman" w:eastAsia="Times New Roman" w:hAnsi="Times New Roman"/>
-                <w:color w:val="000000"/>
-                <w:sz w:val="19"/>
-                <w:szCs w:val="19"/>
-              </w:rPr>
-              <w:t xml:space="preserve">5.7·10⁻⁶</w:t>
-            </w:r>
-          </w:p>
-        </w:tc>
-      </w:tr>
-      <w:tr>
-        <w:trPr>
-          <w:cantSplit/>
-        </w:trPr>
-        <w:tc>
-          <w:tcPr>
-            <w:tcW w:type="pct" w:w="1250"/>
-            <w:shd w:fill="ededeb" w:val="clear"/>
-            <w:tcMar>
-              <w:top w:type="dxa" w:w="50"/>
-              <w:left w:type="dxa" w:w="100"/>
-              <w:bottom w:type="dxa" w:w="50"/>
-              <w:right w:type="dxa" w:w="100"/>
-            </w:tcMar>
-          </w:tcPr>
-          <w:p>
-            <w:r>
-              <w:rPr>
-                <w:rFonts w:ascii="Times New Roman" w:eastAsia="Times New Roman" w:hAnsi="Times New Roman"/>
-                <w:color w:val="000000"/>
-                <w:sz w:val="19"/>
-                <w:szCs w:val="19"/>
-              </w:rPr>
-              <w:t xml:space="preserve">∫⟨u⁶⟩^{1/2}dt</w:t>
-            </w:r>
-          </w:p>
-        </w:tc>
-        <w:tc>
-          <w:tcPr>
-            <w:tcW w:type="pct" w:w="1250"/>
-            <w:shd w:fill="ededeb" w:val="clear"/>
-            <w:tcMar>
-              <w:top w:type="dxa" w:w="50"/>
-              <w:left w:type="dxa" w:w="100"/>
-              <w:bottom w:type="dxa" w:w="50"/>
-              <w:right w:type="dxa" w:w="100"/>
-            </w:tcMar>
-          </w:tcPr>
-          <w:p>
-            <w:r>
-              <w:rPr>
-                <w:rFonts w:ascii="Times New Roman" w:eastAsia="Times New Roman" w:hAnsi="Times New Roman"/>
-                <w:color w:val="000000"/>
-                <w:sz w:val="19"/>
-                <w:szCs w:val="19"/>
-              </w:rPr>
-              <w:t xml:space="preserve">0.516896</w:t>
-            </w:r>
-          </w:p>
-        </w:tc>
-        <w:tc>
-          <w:tcPr>
-            <w:tcW w:type="pct" w:w="1250"/>
-            <w:shd w:fill="ededeb" w:val="clear"/>
-            <w:tcMar>
-              <w:top w:type="dxa" w:w="50"/>
-              <w:left w:type="dxa" w:w="100"/>
-              <w:bottom w:type="dxa" w:w="50"/>
-              <w:right w:type="dxa" w:w="100"/>
-            </w:tcMar>
-          </w:tcPr>
-          <w:p>
-            <w:r>
-              <w:rPr>
-                <w:rFonts w:ascii="Times New Roman" w:eastAsia="Times New Roman" w:hAnsi="Times New Roman"/>
-                <w:color w:val="000000"/>
-                <w:sz w:val="19"/>
-                <w:szCs w:val="19"/>
-              </w:rPr>
-              <w:t xml:space="preserve">0.516893</w:t>
-            </w:r>
-          </w:p>
-        </w:tc>
-        <w:tc>
-          <w:tcPr>
-            <w:tcW w:type="pct" w:w="1250"/>
-            <w:shd w:fill="ededeb" w:val="clear"/>
-            <w:tcMar>
-              <w:top w:type="dxa" w:w="50"/>
-              <w:left w:type="dxa" w:w="100"/>
-              <w:bottom w:type="dxa" w:w="50"/>
-              <w:right w:type="dxa" w:w="100"/>
-            </w:tcMar>
-          </w:tcPr>
-          <w:p>
-            <w:r>
-              <w:rPr>
-                <w:rFonts w:ascii="Times New Roman" w:eastAsia="Times New Roman" w:hAnsi="Times New Roman"/>
-                <w:color w:val="000000"/>
-                <w:sz w:val="19"/>
-                <w:szCs w:val="19"/>
-              </w:rPr>
-              <w:t xml:space="preserve">5.1·10⁻⁶</w:t>
-            </w:r>
-          </w:p>
-        </w:tc>
-      </w:tr>
-    </w:tbl>
-    <w:p>
-      <w:pPr>
-        <w:spacing w:after="200" w:before="60"/>
-        <w:jc w:val="center"/>
-      </w:pPr>
-      <w:r>
-        <w:rPr>
-          <w:rFonts w:ascii="Times New Roman" w:eastAsia="Times New Roman" w:hAnsi="Times New Roman"/>
-          <w:i/>
-          <w:iCs/>
-          <w:color w:val="555555"/>
-          <w:sz w:val="20"/>
-          <w:szCs w:val="20"/>
-        </w:rPr>
-        <w:t xml:space="preserve">Table 12.4. Convergence of the smoothness diagnostics under doubling of the resolution (P5-B): run A at 48³ and 96³.</w:t>
-      </w:r>
-    </w:p>
-    <w:p>
-      <w:pPr>
-        <w:spacing w:after="40" w:before="160"/>
-        <w:jc w:val="center"/>
-      </w:pPr>
-      <w:r>
-        <w:drawing>
-          <wp:inline distT="0" distB="0" distL="0" distR="0">
-            <wp:extent cx="5586603" cy="2450487"/>
-            <wp:effectExtent t="0" r="0" b="0" l="0"/>
-            <wp:docPr id="38" name="" descr="" title=""/>
-            <wp:cNvGraphicFramePr>
-              <a:graphicFrameLocks xmlns:a="http://schemas.openxmlformats.org/drawingml/2006/main" noChangeAspect="1"/>
-            </wp:cNvGraphicFramePr>
-            <a:graphic xmlns:a="http://schemas.openxmlformats.org/drawingml/2006/main">
-              <a:graphicData uri="http://schemas.openxmlformats.org/drawingml/2006/picture">
-                <pic:pic xmlns:pic="http://schemas.openxmlformats.org/drawingml/2006/picture">
-                  <pic:nvPicPr>
-                    <pic:cNvPr id="0" name="" descr=""/>
-                    <pic:cNvPicPr>
-                      <a:picLocks noChangeAspect="1" noChangeArrowheads="1"/>
-                    </pic:cNvPicPr>
-                  </pic:nvPicPr>
-                  <pic:blipFill>
-                    <a:blip r:embed="rId48" cstate="none"/>
-                    <a:srcRect/>
-                    <a:stretch>
-                      <a:fillRect/>
-                    </a:stretch>
-                  </pic:blipFill>
-                  <pic:spPr bwMode="auto">
-                    <a:xfrm>
-                      <a:off x="0" y="0"/>
-                      <a:ext cx="5586603" cy="2450487"/>
-                    </a:xfrm>
-                    <a:prstGeom prst="rect">
-                      <a:avLst/>
-                    </a:prstGeom>
-                  </pic:spPr>
-                </pic:pic>
-              </a:graphicData>
-            </a:graphic>
-          </wp:inline>
-        </w:drawing>
-      </w:r>
-    </w:p>
-    <w:p>
-      <w:pPr>
-        <w:spacing w:after="200" w:before="60"/>
-        <w:jc w:val="center"/>
-      </w:pPr>
-      <w:r>
-        <w:rPr>
-          <w:rFonts w:ascii="Times New Roman" w:eastAsia="Times New Roman" w:hAnsi="Times New Roman"/>
-          <w:i/>
-          <w:iCs/>
-          <w:color w:val="555555"/>
-          <w:sz w:val="20"/>
-          <w:szCs w:val="20"/>
-        </w:rPr>
-        <w:t xml:space="preserve">Fig. 11. P5-B, resolution 96³: left — spectra E(k) at t = 5 for the baseline run A (solid) and the hyperdissipative H2 with b = 2 (dashed) on a semilog scale — both tails are exponential, the smoothness certificate survives the doubling of the resolution; right — relative deviation of the diagnostics 48³ → 96³ on a log scale: averaged quantities converge to 10⁻⁶–10⁻⁴, supremum norms stay at the 1–2 % level.</w:t>
+        <w:t xml:space="preserve">What is claimed. (i) The relation C_s(C_K) = 1/(π(3C_K/2)^{3/4}) is derived explicitly, in pinned conventions, and reproduces the classical Lilly value to 6·10⁻⁶. (ii) The corrections — filter shape, finite Δ/η — are quantified and confirmed by Monte-Carlo. (iii) On Gaussian fields the a priori C_s vanishes identically: a spectrum creates no cascade coherence. (iv) On a resolution-limited DNS the a priori value lies below the Gaussian one, and the dynamic procedure detects backscatter. (v) The analytical core agrees across three programming languages to 5–6 digits.</w:t>
       </w:r>
     </w:p>
     <w:p>
@@ -11437,24 +12385,7 @@
           <w:sz w:val="24"/>
           <w:szCs w:val="24"/>
         </w:rPr>
-        <w:t xml:space="preserve">The spectral certificate does not merely survive — it improves. The tail slope at the enstrophy peak changes from σ = −6.64 to σ = −11.30, and the power-law fit quality grows from R² = 0.969 to 0.993: with a larger k_max the distance to the dissipative frontier increases and the tail is measured at a deeper level — the certificate band moves from [11, 16] to [22, 32]. The hyperdissipative run H2 (b = 2) at 96³ raises k_max/η_b from 6.2 to 12.4, yet the deviation of the measured dissipation peak from the prediction x*(b) remains at 10.9 % — exactly as on 48³. This is important negative information: the residual deviation is not resolution-limited but model-form-limited — it is produced by the shape of the Pao spectrum in the dissipative range, and doubling the grid does not remove it. The protocol records this explicitly, separating the discretization error from the closure error.</w:t>
-      </w:r>
-    </w:p>
-    <w:p>
-      <w:pPr>
-        <w:pStyle w:val="Heading2"/>
-        <w:spacing w:after="160" w:before="320" w:line="360"/>
-      </w:pPr>
-      <w:r>
-        <w:rPr>
-          <w:rFonts w:ascii="Times New Roman" w:eastAsia="Times New Roman" w:hAnsi="Times New Roman"/>
-          <w:b/>
-          <w:bCs/>
-          <w:color w:val="000000"/>
-          <w:sz w:val="28"/>
-          <w:szCs w:val="28"/>
-        </w:rPr>
-        <w:t xml:space="preserve">12.8. Vortex stretching statistics: random-field ensembles</w:t>
+        <w:t xml:space="preserve">What is not claimed. We do not claim historical priority for the algebra: the Lilly matching is described in the 1960s literature. We do not «derive» C_K from first principles: the Heisenberg closure reduces it to a transfer constant α calibrated by experiment — the honest status of any two-point closure. The a priori value on the 48³ DNS is a lower bound due to resolution, not an exact measurement. The program's web application is two-dimensional and visual: its spectra are qualitative by construction. Finally, there is no shell model in the program: the exploration stage showed that the space of strictly local three-term energy-conserving triads is degenerate, and shell-model C_K calibrations are model-dependent; the direct spectral route proved cleaner (chapter 8).</w:t>
       </w:r>
     </w:p>
     <w:p>
@@ -11470,8 +12401,27 @@
           <w:sz w:val="24"/>
           <w:szCs w:val="24"/>
         </w:rPr>
-        <w:t xml:space="preserve">The certificates of Sections 12.3–12.5 establish that the solution stays smooth, but they do not ask whose smoothness is being certified: does the trajectory keep the statistical anatomy of a genuine 3D cascade — or is it a degenerate flow for which all the gates close trivially? The mechanism the whole chapter rests on — stretching of vorticity by strain — has measurable invariants: the normalized stretching rate α = (ω_i S_ij ω_j)/(|ω|² s_rms), the parameter β_S = ⟨λ₂⟩/(⟨λ₁⟩ − ⟨λ₃⟩) locating the mean intermediate strain eigenvalue, and the alignment cos²θ_i — the distribution of vorticity directions over the strain eigensystem. The P5-C protocol (code/python/p5c_stretch_ensemble.py) computes these statistics on three families of 96³ fields: a Gaussian ensemble GAU of 32 synthetic K41 fields from the Pao generator (the P3 algorithm), eight phase surrogates SUR of a DNS snapshot (spectral amplitudes preserved, phases randomized, Leray projection and energy renormalization), and three snapshots of the DNS itself at t = 4, 5, 6.</w:t>
-      </w:r>
+        <w:t xml:space="preserve">A natural continuation is a 256³ DNS with k_max/k_η ≥ 1.5, on which the a priori branch of P4 becomes quantitative; the compute budget of such a run (about eight core-hours) is within reach of a workstation. A second direction is applying the dynamic procedure to the b-rotation ansatz: the energy-neutral mechanism of the parent program has no dissipative constant by construction, and measuring the effective eddy response of the b-field dynamically is a self-standing problem. A third direction — the 3D smoothness program with BKM/LPS diagnostics, the b-protocol and the hyperdissipative family — has since been executed as protocol P5 and is reported in chapter 12.</w:t>
+      </w:r>
+    </w:p>
+    <w:p>
+      <w:pPr>
+        <w:pStyle w:val="Heading1"/>
+        <w:spacing w:after="240" w:before="480" w:line="360"/>
+      </w:pPr>
+      <w:bookmarkStart w:id="100041" w:name="_Toc100041"/>
+      <w:r>
+        <w:rPr>
+          <w:rFonts w:ascii="Times New Roman" w:eastAsia="Times New Roman" w:hAnsi="Times New Roman"/>
+          <w:b/>
+          <w:bCs/>
+          <w:color w:val="000000"/>
+          <w:sz w:val="32"/>
+          <w:szCs w:val="32"/>
+        </w:rPr>
+        <w:t xml:space="preserve">14. Conclusions</w:t>
+      </w:r>
+      <w:bookmarkEnd w:id="100041"/>
     </w:p>
     <w:p>
       <w:pPr>
@@ -11486,1323 +12436,27 @@
           <w:sz w:val="24"/>
           <w:szCs w:val="24"/>
         </w:rPr>
-        <w:t xml:space="preserve">The null check of the theory passes exactly. For Gaussian fields vorticity and strain are independent, so all alignment must vanish: the measurement yields ⟨α⟩ = 0.0007 ± 0.0036, β_S = 0.0007 ± 0.0031 and cos²θ_i = (0.334, 0.334, 0.332) against the theoretical 1/3 (Table 12.5). Phase surrogates, which preserve the entire DNS spectrum but destroy the phase structure, give ⟨α⟩ = 0.006 ± 0.007 — zero within the error. Two methodological conclusions follow. First, a single energy spectrum function, even an exact one, creates neither stretching nor alignment — these are dynamical, not spectral, properties of a field. Second, the same result is a quality control of the measurement pipeline: any bias it might carry would show up on the Gaussian fields as well.</w:t>
-      </w:r>
-    </w:p>
-    <w:p>
-      <w:pPr>
-        <w:spacing w:before="160"/>
-      </w:pPr>
-    </w:p>
-    <w:tbl>
-      <w:tblPr>
-        <w:tblW w:type="pct" w:w="4900"/>
-        <w:jc w:val="center"/>
-        <w:tblBorders>
-          <w:top w:val="single" w:color="c5bfac" w:sz="2"/>
-          <w:left w:val="none" w:color="FFFFFF" w:sz="0"/>
-          <w:bottom w:val="single" w:color="c5bfac" w:sz="2"/>
-          <w:right w:val="none" w:color="FFFFFF" w:sz="0"/>
-          <w:insideH w:val="single" w:color="d8d5cd" w:sz="1"/>
-          <w:insideV w:val="none" w:color="FFFFFF" w:sz="0"/>
-        </w:tblBorders>
-      </w:tblPr>
-      <w:tblGrid>
-        <w:gridCol w:w="1230"/>
-        <w:gridCol w:w="1230"/>
-        <w:gridCol w:w="1230"/>
-        <w:gridCol w:w="1230"/>
-        <w:gridCol w:w="1230"/>
-        <w:gridCol w:w="1230"/>
-        <w:gridCol w:w="1230"/>
-      </w:tblGrid>
-      <w:tr>
-        <w:trPr>
-          <w:cantSplit/>
-          <w:tblHeader/>
-        </w:trPr>
-        <w:tc>
-          <w:tcPr>
-            <w:tcW w:type="pct" w:w="714"/>
-            <w:shd w:fill="4e4732" w:val="clear"/>
-            <w:tcMar>
-              <w:top w:type="dxa" w:w="60"/>
-              <w:left w:type="dxa" w:w="100"/>
-              <w:bottom w:type="dxa" w:w="60"/>
-              <w:right w:type="dxa" w:w="100"/>
-            </w:tcMar>
-          </w:tcPr>
-          <w:p>
-            <w:r>
-              <w:rPr>
-                <w:rFonts w:ascii="Times New Roman" w:eastAsia="Times New Roman" w:hAnsi="Times New Roman"/>
-                <w:b/>
-                <w:bCs/>
-                <w:color w:val="FFFFFF"/>
-                <w:sz w:val="19"/>
-                <w:szCs w:val="19"/>
-              </w:rPr>
-              <w:t xml:space="preserve">Ensemble</w:t>
-            </w:r>
-          </w:p>
-        </w:tc>
-        <w:tc>
-          <w:tcPr>
-            <w:tcW w:type="pct" w:w="714"/>
-            <w:shd w:fill="4e4732" w:val="clear"/>
-            <w:tcMar>
-              <w:top w:type="dxa" w:w="60"/>
-              <w:left w:type="dxa" w:w="100"/>
-              <w:bottom w:type="dxa" w:w="60"/>
-              <w:right w:type="dxa" w:w="100"/>
-            </w:tcMar>
-          </w:tcPr>
-          <w:p>
-            <w:r>
-              <w:rPr>
-                <w:rFonts w:ascii="Times New Roman" w:eastAsia="Times New Roman" w:hAnsi="Times New Roman"/>
-                <w:b/>
-                <w:bCs/>
-                <w:color w:val="FFFFFF"/>
-                <w:sz w:val="19"/>
-                <w:szCs w:val="19"/>
-              </w:rPr>
-              <w:t xml:space="preserve">N</w:t>
-            </w:r>
-          </w:p>
-        </w:tc>
-        <w:tc>
-          <w:tcPr>
-            <w:tcW w:type="pct" w:w="714"/>
-            <w:shd w:fill="4e4732" w:val="clear"/>
-            <w:tcMar>
-              <w:top w:type="dxa" w:w="60"/>
-              <w:left w:type="dxa" w:w="100"/>
-              <w:bottom w:type="dxa" w:w="60"/>
-              <w:right w:type="dxa" w:w="100"/>
-            </w:tcMar>
-          </w:tcPr>
-          <w:p>
-            <w:r>
-              <w:rPr>
-                <w:rFonts w:ascii="Times New Roman" w:eastAsia="Times New Roman" w:hAnsi="Times New Roman"/>
-                <w:b/>
-                <w:bCs/>
-                <w:color w:val="FFFFFF"/>
-                <w:sz w:val="19"/>
-                <w:szCs w:val="19"/>
-              </w:rPr>
-              <w:t xml:space="preserve">⟨α⟩</w:t>
-            </w:r>
-          </w:p>
-        </w:tc>
-        <w:tc>
-          <w:tcPr>
-            <w:tcW w:type="pct" w:w="714"/>
-            <w:shd w:fill="4e4732" w:val="clear"/>
-            <w:tcMar>
-              <w:top w:type="dxa" w:w="60"/>
-              <w:left w:type="dxa" w:w="100"/>
-              <w:bottom w:type="dxa" w:w="60"/>
-              <w:right w:type="dxa" w:w="100"/>
-            </w:tcMar>
-          </w:tcPr>
-          <w:p>
-            <w:r>
-              <w:rPr>
-                <w:rFonts w:ascii="Times New Roman" w:eastAsia="Times New Roman" w:hAnsi="Times New Roman"/>
-                <w:b/>
-                <w:bCs/>
-                <w:color w:val="FFFFFF"/>
-                <w:sz w:val="19"/>
-                <w:szCs w:val="19"/>
-              </w:rPr>
-              <w:t xml:space="preserve">β_S</w:t>
-            </w:r>
-          </w:p>
-        </w:tc>
-        <w:tc>
-          <w:tcPr>
-            <w:tcW w:type="pct" w:w="714"/>
-            <w:shd w:fill="4e4732" w:val="clear"/>
-            <w:tcMar>
-              <w:top w:type="dxa" w:w="60"/>
-              <w:left w:type="dxa" w:w="100"/>
-              <w:bottom w:type="dxa" w:w="60"/>
-              <w:right w:type="dxa" w:w="100"/>
-            </w:tcMar>
-          </w:tcPr>
-          <w:p>
-            <w:r>
-              <w:rPr>
-                <w:rFonts w:ascii="Times New Roman" w:eastAsia="Times New Roman" w:hAnsi="Times New Roman"/>
-                <w:b/>
-                <w:bCs/>
-                <w:color w:val="FFFFFF"/>
-                <w:sz w:val="19"/>
-                <w:szCs w:val="19"/>
-              </w:rPr>
-              <w:t xml:space="preserve">cos²θ₁</w:t>
-            </w:r>
-          </w:p>
-        </w:tc>
-        <w:tc>
-          <w:tcPr>
-            <w:tcW w:type="pct" w:w="714"/>
-            <w:shd w:fill="4e4732" w:val="clear"/>
-            <w:tcMar>
-              <w:top w:type="dxa" w:w="60"/>
-              <w:left w:type="dxa" w:w="100"/>
-              <w:bottom w:type="dxa" w:w="60"/>
-              <w:right w:type="dxa" w:w="100"/>
-            </w:tcMar>
-          </w:tcPr>
-          <w:p>
-            <w:r>
-              <w:rPr>
-                <w:rFonts w:ascii="Times New Roman" w:eastAsia="Times New Roman" w:hAnsi="Times New Roman"/>
-                <w:b/>
-                <w:bCs/>
-                <w:color w:val="FFFFFF"/>
-                <w:sz w:val="19"/>
-                <w:szCs w:val="19"/>
-              </w:rPr>
-              <w:t xml:space="preserve">cos²θ₂</w:t>
-            </w:r>
-          </w:p>
-        </w:tc>
-        <w:tc>
-          <w:tcPr>
-            <w:tcW w:type="pct" w:w="714"/>
-            <w:shd w:fill="4e4732" w:val="clear"/>
-            <w:tcMar>
-              <w:top w:type="dxa" w:w="60"/>
-              <w:left w:type="dxa" w:w="100"/>
-              <w:bottom w:type="dxa" w:w="60"/>
-              <w:right w:type="dxa" w:w="100"/>
-            </w:tcMar>
-          </w:tcPr>
-          <w:p>
-            <w:r>
-              <w:rPr>
-                <w:rFonts w:ascii="Times New Roman" w:eastAsia="Times New Roman" w:hAnsi="Times New Roman"/>
-                <w:b/>
-                <w:bCs/>
-                <w:color w:val="FFFFFF"/>
-                <w:sz w:val="19"/>
-                <w:szCs w:val="19"/>
-              </w:rPr>
-              <w:t xml:space="preserve">cos²θ₃</w:t>
-            </w:r>
-          </w:p>
-        </w:tc>
-      </w:tr>
-      <w:tr>
-        <w:trPr>
-          <w:cantSplit/>
-        </w:trPr>
-        <w:tc>
-          <w:tcPr>
-            <w:tcW w:type="pct" w:w="714"/>
-            <w:shd w:fill="FFFFFF" w:val="clear"/>
-            <w:tcMar>
-              <w:top w:type="dxa" w:w="50"/>
-              <w:left w:type="dxa" w:w="100"/>
-              <w:bottom w:type="dxa" w:w="50"/>
-              <w:right w:type="dxa" w:w="100"/>
-            </w:tcMar>
-          </w:tcPr>
-          <w:p>
-            <w:r>
-              <w:rPr>
-                <w:rFonts w:ascii="Times New Roman" w:eastAsia="Times New Roman" w:hAnsi="Times New Roman"/>
-                <w:color w:val="000000"/>
-                <w:sz w:val="19"/>
-                <w:szCs w:val="19"/>
-              </w:rPr>
-              <w:t xml:space="preserve">GAU (K41, Gaussian)</w:t>
-            </w:r>
-          </w:p>
-        </w:tc>
-        <w:tc>
-          <w:tcPr>
-            <w:tcW w:type="pct" w:w="714"/>
-            <w:shd w:fill="FFFFFF" w:val="clear"/>
-            <w:tcMar>
-              <w:top w:type="dxa" w:w="50"/>
-              <w:left w:type="dxa" w:w="100"/>
-              <w:bottom w:type="dxa" w:w="50"/>
-              <w:right w:type="dxa" w:w="100"/>
-            </w:tcMar>
-          </w:tcPr>
-          <w:p>
-            <w:r>
-              <w:rPr>
-                <w:rFonts w:ascii="Times New Roman" w:eastAsia="Times New Roman" w:hAnsi="Times New Roman"/>
-                <w:color w:val="000000"/>
-                <w:sz w:val="19"/>
-                <w:szCs w:val="19"/>
-              </w:rPr>
-              <w:t xml:space="preserve">32</w:t>
-            </w:r>
-          </w:p>
-        </w:tc>
-        <w:tc>
-          <w:tcPr>
-            <w:tcW w:type="pct" w:w="714"/>
-            <w:shd w:fill="FFFFFF" w:val="clear"/>
-            <w:tcMar>
-              <w:top w:type="dxa" w:w="50"/>
-              <w:left w:type="dxa" w:w="100"/>
-              <w:bottom w:type="dxa" w:w="50"/>
-              <w:right w:type="dxa" w:w="100"/>
-            </w:tcMar>
-          </w:tcPr>
-          <w:p>
-            <w:r>
-              <w:rPr>
-                <w:rFonts w:ascii="Times New Roman" w:eastAsia="Times New Roman" w:hAnsi="Times New Roman"/>
-                <w:color w:val="000000"/>
-                <w:sz w:val="19"/>
-                <w:szCs w:val="19"/>
-              </w:rPr>
-              <w:t xml:space="preserve">0.0007 ± 0.0036</w:t>
-            </w:r>
-          </w:p>
-        </w:tc>
-        <w:tc>
-          <w:tcPr>
-            <w:tcW w:type="pct" w:w="714"/>
-            <w:shd w:fill="FFFFFF" w:val="clear"/>
-            <w:tcMar>
-              <w:top w:type="dxa" w:w="50"/>
-              <w:left w:type="dxa" w:w="100"/>
-              <w:bottom w:type="dxa" w:w="50"/>
-              <w:right w:type="dxa" w:w="100"/>
-            </w:tcMar>
-          </w:tcPr>
-          <w:p>
-            <w:r>
-              <w:rPr>
-                <w:rFonts w:ascii="Times New Roman" w:eastAsia="Times New Roman" w:hAnsi="Times New Roman"/>
-                <w:color w:val="000000"/>
-                <w:sz w:val="19"/>
-                <w:szCs w:val="19"/>
-              </w:rPr>
-              <w:t xml:space="preserve">0.0007 ± 0.0031</w:t>
-            </w:r>
-          </w:p>
-        </w:tc>
-        <w:tc>
-          <w:tcPr>
-            <w:tcW w:type="pct" w:w="714"/>
-            <w:shd w:fill="FFFFFF" w:val="clear"/>
-            <w:tcMar>
-              <w:top w:type="dxa" w:w="50"/>
-              <w:left w:type="dxa" w:w="100"/>
-              <w:bottom w:type="dxa" w:w="50"/>
-              <w:right w:type="dxa" w:w="100"/>
-            </w:tcMar>
-          </w:tcPr>
-          <w:p>
-            <w:r>
-              <w:rPr>
-                <w:rFonts w:ascii="Times New Roman" w:eastAsia="Times New Roman" w:hAnsi="Times New Roman"/>
-                <w:color w:val="000000"/>
-                <w:sz w:val="19"/>
-                <w:szCs w:val="19"/>
-              </w:rPr>
-              <w:t xml:space="preserve">0.334</w:t>
-            </w:r>
-          </w:p>
-        </w:tc>
-        <w:tc>
-          <w:tcPr>
-            <w:tcW w:type="pct" w:w="714"/>
-            <w:shd w:fill="FFFFFF" w:val="clear"/>
-            <w:tcMar>
-              <w:top w:type="dxa" w:w="50"/>
-              <w:left w:type="dxa" w:w="100"/>
-              <w:bottom w:type="dxa" w:w="50"/>
-              <w:right w:type="dxa" w:w="100"/>
-            </w:tcMar>
-          </w:tcPr>
-          <w:p>
-            <w:r>
-              <w:rPr>
-                <w:rFonts w:ascii="Times New Roman" w:eastAsia="Times New Roman" w:hAnsi="Times New Roman"/>
-                <w:color w:val="000000"/>
-                <w:sz w:val="19"/>
-                <w:szCs w:val="19"/>
-              </w:rPr>
-              <w:t xml:space="preserve">0.334</w:t>
-            </w:r>
-          </w:p>
-        </w:tc>
-        <w:tc>
-          <w:tcPr>
-            <w:tcW w:type="pct" w:w="714"/>
-            <w:shd w:fill="FFFFFF" w:val="clear"/>
-            <w:tcMar>
-              <w:top w:type="dxa" w:w="50"/>
-              <w:left w:type="dxa" w:w="100"/>
-              <w:bottom w:type="dxa" w:w="50"/>
-              <w:right w:type="dxa" w:w="100"/>
-            </w:tcMar>
-          </w:tcPr>
-          <w:p>
-            <w:r>
-              <w:rPr>
-                <w:rFonts w:ascii="Times New Roman" w:eastAsia="Times New Roman" w:hAnsi="Times New Roman"/>
-                <w:color w:val="000000"/>
-                <w:sz w:val="19"/>
-                <w:szCs w:val="19"/>
-              </w:rPr>
-              <w:t xml:space="preserve">0.332</w:t>
-            </w:r>
-          </w:p>
-        </w:tc>
-      </w:tr>
-      <w:tr>
-        <w:trPr>
-          <w:cantSplit/>
-        </w:trPr>
-        <w:tc>
-          <w:tcPr>
-            <w:tcW w:type="pct" w:w="714"/>
-            <w:shd w:fill="ededeb" w:val="clear"/>
-            <w:tcMar>
-              <w:top w:type="dxa" w:w="50"/>
-              <w:left w:type="dxa" w:w="100"/>
-              <w:bottom w:type="dxa" w:w="50"/>
-              <w:right w:type="dxa" w:w="100"/>
-            </w:tcMar>
-          </w:tcPr>
-          <w:p>
-            <w:r>
-              <w:rPr>
-                <w:rFonts w:ascii="Times New Roman" w:eastAsia="Times New Roman" w:hAnsi="Times New Roman"/>
-                <w:color w:val="000000"/>
-                <w:sz w:val="19"/>
-                <w:szCs w:val="19"/>
-              </w:rPr>
-              <w:t xml:space="preserve">SUR (phase surrogates)</w:t>
-            </w:r>
-          </w:p>
-        </w:tc>
-        <w:tc>
-          <w:tcPr>
-            <w:tcW w:type="pct" w:w="714"/>
-            <w:shd w:fill="ededeb" w:val="clear"/>
-            <w:tcMar>
-              <w:top w:type="dxa" w:w="50"/>
-              <w:left w:type="dxa" w:w="100"/>
-              <w:bottom w:type="dxa" w:w="50"/>
-              <w:right w:type="dxa" w:w="100"/>
-            </w:tcMar>
-          </w:tcPr>
-          <w:p>
-            <w:r>
-              <w:rPr>
-                <w:rFonts w:ascii="Times New Roman" w:eastAsia="Times New Roman" w:hAnsi="Times New Roman"/>
-                <w:color w:val="000000"/>
-                <w:sz w:val="19"/>
-                <w:szCs w:val="19"/>
-              </w:rPr>
-              <w:t xml:space="preserve">8</w:t>
-            </w:r>
-          </w:p>
-        </w:tc>
-        <w:tc>
-          <w:tcPr>
-            <w:tcW w:type="pct" w:w="714"/>
-            <w:shd w:fill="ededeb" w:val="clear"/>
-            <w:tcMar>
-              <w:top w:type="dxa" w:w="50"/>
-              <w:left w:type="dxa" w:w="100"/>
-              <w:bottom w:type="dxa" w:w="50"/>
-              <w:right w:type="dxa" w:w="100"/>
-            </w:tcMar>
-          </w:tcPr>
-          <w:p>
-            <w:r>
-              <w:rPr>
-                <w:rFonts w:ascii="Times New Roman" w:eastAsia="Times New Roman" w:hAnsi="Times New Roman"/>
-                <w:color w:val="000000"/>
-                <w:sz w:val="19"/>
-                <w:szCs w:val="19"/>
-              </w:rPr>
-              <w:t xml:space="preserve">0.006 ± 0.007</w:t>
-            </w:r>
-          </w:p>
-        </w:tc>
-        <w:tc>
-          <w:tcPr>
-            <w:tcW w:type="pct" w:w="714"/>
-            <w:shd w:fill="ededeb" w:val="clear"/>
-            <w:tcMar>
-              <w:top w:type="dxa" w:w="50"/>
-              <w:left w:type="dxa" w:w="100"/>
-              <w:bottom w:type="dxa" w:w="50"/>
-              <w:right w:type="dxa" w:w="100"/>
-            </w:tcMar>
-          </w:tcPr>
-          <w:p>
-            <w:r>
-              <w:rPr>
-                <w:rFonts w:ascii="Times New Roman" w:eastAsia="Times New Roman" w:hAnsi="Times New Roman"/>
-                <w:color w:val="000000"/>
-                <w:sz w:val="19"/>
-                <w:szCs w:val="19"/>
-              </w:rPr>
-              <w:t xml:space="preserve">0.006 ± 0.006</w:t>
-            </w:r>
-          </w:p>
-        </w:tc>
-        <w:tc>
-          <w:tcPr>
-            <w:tcW w:type="pct" w:w="714"/>
-            <w:shd w:fill="ededeb" w:val="clear"/>
-            <w:tcMar>
-              <w:top w:type="dxa" w:w="50"/>
-              <w:left w:type="dxa" w:w="100"/>
-              <w:bottom w:type="dxa" w:w="50"/>
-              <w:right w:type="dxa" w:w="100"/>
-            </w:tcMar>
-          </w:tcPr>
-          <w:p>
-            <w:r>
-              <w:rPr>
-                <w:rFonts w:ascii="Times New Roman" w:eastAsia="Times New Roman" w:hAnsi="Times New Roman"/>
-                <w:color w:val="000000"/>
-                <w:sz w:val="19"/>
-                <w:szCs w:val="19"/>
-              </w:rPr>
-              <w:t xml:space="preserve">0.328</w:t>
-            </w:r>
-          </w:p>
-        </w:tc>
-        <w:tc>
-          <w:tcPr>
-            <w:tcW w:type="pct" w:w="714"/>
-            <w:shd w:fill="ededeb" w:val="clear"/>
-            <w:tcMar>
-              <w:top w:type="dxa" w:w="50"/>
-              <w:left w:type="dxa" w:w="100"/>
-              <w:bottom w:type="dxa" w:w="50"/>
-              <w:right w:type="dxa" w:w="100"/>
-            </w:tcMar>
-          </w:tcPr>
-          <w:p>
-            <w:r>
-              <w:rPr>
-                <w:rFonts w:ascii="Times New Roman" w:eastAsia="Times New Roman" w:hAnsi="Times New Roman"/>
-                <w:color w:val="000000"/>
-                <w:sz w:val="19"/>
-                <w:szCs w:val="19"/>
-              </w:rPr>
-              <w:t xml:space="preserve">0.352</w:t>
-            </w:r>
-          </w:p>
-        </w:tc>
-        <w:tc>
-          <w:tcPr>
-            <w:tcW w:type="pct" w:w="714"/>
-            <w:shd w:fill="ededeb" w:val="clear"/>
-            <w:tcMar>
-              <w:top w:type="dxa" w:w="50"/>
-              <w:left w:type="dxa" w:w="100"/>
-              <w:bottom w:type="dxa" w:w="50"/>
-              <w:right w:type="dxa" w:w="100"/>
-            </w:tcMar>
-          </w:tcPr>
-          <w:p>
-            <w:r>
-              <w:rPr>
-                <w:rFonts w:ascii="Times New Roman" w:eastAsia="Times New Roman" w:hAnsi="Times New Roman"/>
-                <w:color w:val="000000"/>
-                <w:sz w:val="19"/>
-                <w:szCs w:val="19"/>
-              </w:rPr>
-              <w:t xml:space="preserve">0.320</w:t>
-            </w:r>
-          </w:p>
-        </w:tc>
-      </w:tr>
-      <w:tr>
-        <w:trPr>
-          <w:cantSplit/>
-        </w:trPr>
-        <w:tc>
-          <w:tcPr>
-            <w:tcW w:type="pct" w:w="714"/>
-            <w:shd w:fill="FFFFFF" w:val="clear"/>
-            <w:tcMar>
-              <w:top w:type="dxa" w:w="50"/>
-              <w:left w:type="dxa" w:w="100"/>
-              <w:bottom w:type="dxa" w:w="50"/>
-              <w:right w:type="dxa" w:w="100"/>
-            </w:tcMar>
-          </w:tcPr>
-          <w:p>
-            <w:r>
-              <w:rPr>
-                <w:rFonts w:ascii="Times New Roman" w:eastAsia="Times New Roman" w:hAnsi="Times New Roman"/>
-                <w:color w:val="000000"/>
-                <w:sz w:val="19"/>
-                <w:szCs w:val="19"/>
-              </w:rPr>
-              <w:t xml:space="preserve">DNS 96³, t = 4</w:t>
-            </w:r>
-          </w:p>
-        </w:tc>
-        <w:tc>
-          <w:tcPr>
-            <w:tcW w:type="pct" w:w="714"/>
-            <w:shd w:fill="FFFFFF" w:val="clear"/>
-            <w:tcMar>
-              <w:top w:type="dxa" w:w="50"/>
-              <w:left w:type="dxa" w:w="100"/>
-              <w:bottom w:type="dxa" w:w="50"/>
-              <w:right w:type="dxa" w:w="100"/>
-            </w:tcMar>
-          </w:tcPr>
-          <w:p>
-            <w:r>
-              <w:rPr>
-                <w:rFonts w:ascii="Times New Roman" w:eastAsia="Times New Roman" w:hAnsi="Times New Roman"/>
-                <w:color w:val="000000"/>
-                <w:sz w:val="19"/>
-                <w:szCs w:val="19"/>
-              </w:rPr>
-              <w:t xml:space="preserve">1</w:t>
-            </w:r>
-          </w:p>
-        </w:tc>
-        <w:tc>
-          <w:tcPr>
-            <w:tcW w:type="pct" w:w="714"/>
-            <w:shd w:fill="FFFFFF" w:val="clear"/>
-            <w:tcMar>
-              <w:top w:type="dxa" w:w="50"/>
-              <w:left w:type="dxa" w:w="100"/>
-              <w:bottom w:type="dxa" w:w="50"/>
-              <w:right w:type="dxa" w:w="100"/>
-            </w:tcMar>
-          </w:tcPr>
-          <w:p>
-            <w:r>
-              <w:rPr>
-                <w:rFonts w:ascii="Times New Roman" w:eastAsia="Times New Roman" w:hAnsi="Times New Roman"/>
-                <w:color w:val="000000"/>
-                <w:sz w:val="19"/>
-                <w:szCs w:val="19"/>
-              </w:rPr>
-              <w:t xml:space="preserve">0.125</w:t>
-            </w:r>
-          </w:p>
-        </w:tc>
-        <w:tc>
-          <w:tcPr>
-            <w:tcW w:type="pct" w:w="714"/>
-            <w:shd w:fill="FFFFFF" w:val="clear"/>
-            <w:tcMar>
-              <w:top w:type="dxa" w:w="50"/>
-              <w:left w:type="dxa" w:w="100"/>
-              <w:bottom w:type="dxa" w:w="50"/>
-              <w:right w:type="dxa" w:w="100"/>
-            </w:tcMar>
-          </w:tcPr>
-          <w:p>
-            <w:r>
-              <w:rPr>
-                <w:rFonts w:ascii="Times New Roman" w:eastAsia="Times New Roman" w:hAnsi="Times New Roman"/>
-                <w:color w:val="000000"/>
-                <w:sz w:val="19"/>
-                <w:szCs w:val="19"/>
-              </w:rPr>
-              <w:t xml:space="preserve">0.115</w:t>
-            </w:r>
-          </w:p>
-        </w:tc>
-        <w:tc>
-          <w:tcPr>
-            <w:tcW w:type="pct" w:w="714"/>
-            <w:shd w:fill="FFFFFF" w:val="clear"/>
-            <w:tcMar>
-              <w:top w:type="dxa" w:w="50"/>
-              <w:left w:type="dxa" w:w="100"/>
-              <w:bottom w:type="dxa" w:w="50"/>
-              <w:right w:type="dxa" w:w="100"/>
-            </w:tcMar>
-          </w:tcPr>
-          <w:p>
-            <w:r>
-              <w:rPr>
-                <w:rFonts w:ascii="Times New Roman" w:eastAsia="Times New Roman" w:hAnsi="Times New Roman"/>
-                <w:color w:val="000000"/>
-                <w:sz w:val="19"/>
-                <w:szCs w:val="19"/>
-              </w:rPr>
-              <w:t xml:space="preserve">0.299</w:t>
-            </w:r>
-          </w:p>
-        </w:tc>
-        <w:tc>
-          <w:tcPr>
-            <w:tcW w:type="pct" w:w="714"/>
-            <w:shd w:fill="FFFFFF" w:val="clear"/>
-            <w:tcMar>
-              <w:top w:type="dxa" w:w="50"/>
-              <w:left w:type="dxa" w:w="100"/>
-              <w:bottom w:type="dxa" w:w="50"/>
-              <w:right w:type="dxa" w:w="100"/>
-            </w:tcMar>
-          </w:tcPr>
-          <w:p>
-            <w:r>
-              <w:rPr>
-                <w:rFonts w:ascii="Times New Roman" w:eastAsia="Times New Roman" w:hAnsi="Times New Roman"/>
-                <w:color w:val="000000"/>
-                <w:sz w:val="19"/>
-                <w:szCs w:val="19"/>
-              </w:rPr>
-              <w:t xml:space="preserve">0.446</w:t>
-            </w:r>
-          </w:p>
-        </w:tc>
-        <w:tc>
-          <w:tcPr>
-            <w:tcW w:type="pct" w:w="714"/>
-            <w:shd w:fill="FFFFFF" w:val="clear"/>
-            <w:tcMar>
-              <w:top w:type="dxa" w:w="50"/>
-              <w:left w:type="dxa" w:w="100"/>
-              <w:bottom w:type="dxa" w:w="50"/>
-              <w:right w:type="dxa" w:w="100"/>
-            </w:tcMar>
-          </w:tcPr>
-          <w:p>
-            <w:r>
-              <w:rPr>
-                <w:rFonts w:ascii="Times New Roman" w:eastAsia="Times New Roman" w:hAnsi="Times New Roman"/>
-                <w:color w:val="000000"/>
-                <w:sz w:val="19"/>
-                <w:szCs w:val="19"/>
-              </w:rPr>
-              <w:t xml:space="preserve">0.255</w:t>
-            </w:r>
-          </w:p>
-        </w:tc>
-      </w:tr>
-      <w:tr>
-        <w:trPr>
-          <w:cantSplit/>
-        </w:trPr>
-        <w:tc>
-          <w:tcPr>
-            <w:tcW w:type="pct" w:w="714"/>
-            <w:shd w:fill="ededeb" w:val="clear"/>
-            <w:tcMar>
-              <w:top w:type="dxa" w:w="50"/>
-              <w:left w:type="dxa" w:w="100"/>
-              <w:bottom w:type="dxa" w:w="50"/>
-              <w:right w:type="dxa" w:w="100"/>
-            </w:tcMar>
-          </w:tcPr>
-          <w:p>
-            <w:r>
-              <w:rPr>
-                <w:rFonts w:ascii="Times New Roman" w:eastAsia="Times New Roman" w:hAnsi="Times New Roman"/>
-                <w:color w:val="000000"/>
-                <w:sz w:val="19"/>
-                <w:szCs w:val="19"/>
-              </w:rPr>
-              <w:t xml:space="preserve">DNS 96³, t = 5</w:t>
-            </w:r>
-          </w:p>
-        </w:tc>
-        <w:tc>
-          <w:tcPr>
-            <w:tcW w:type="pct" w:w="714"/>
-            <w:shd w:fill="ededeb" w:val="clear"/>
-            <w:tcMar>
-              <w:top w:type="dxa" w:w="50"/>
-              <w:left w:type="dxa" w:w="100"/>
-              <w:bottom w:type="dxa" w:w="50"/>
-              <w:right w:type="dxa" w:w="100"/>
-            </w:tcMar>
-          </w:tcPr>
-          <w:p>
-            <w:r>
-              <w:rPr>
-                <w:rFonts w:ascii="Times New Roman" w:eastAsia="Times New Roman" w:hAnsi="Times New Roman"/>
-                <w:color w:val="000000"/>
-                <w:sz w:val="19"/>
-                <w:szCs w:val="19"/>
-              </w:rPr>
-              <w:t xml:space="preserve">1</w:t>
-            </w:r>
-          </w:p>
-        </w:tc>
-        <w:tc>
-          <w:tcPr>
-            <w:tcW w:type="pct" w:w="714"/>
-            <w:shd w:fill="ededeb" w:val="clear"/>
-            <w:tcMar>
-              <w:top w:type="dxa" w:w="50"/>
-              <w:left w:type="dxa" w:w="100"/>
-              <w:bottom w:type="dxa" w:w="50"/>
-              <w:right w:type="dxa" w:w="100"/>
-            </w:tcMar>
-          </w:tcPr>
-          <w:p>
-            <w:r>
-              <w:rPr>
-                <w:rFonts w:ascii="Times New Roman" w:eastAsia="Times New Roman" w:hAnsi="Times New Roman"/>
-                <w:color w:val="000000"/>
-                <w:sz w:val="19"/>
-                <w:szCs w:val="19"/>
-              </w:rPr>
-              <w:t xml:space="preserve">0.091</w:t>
-            </w:r>
-          </w:p>
-        </w:tc>
-        <w:tc>
-          <w:tcPr>
-            <w:tcW w:type="pct" w:w="714"/>
-            <w:shd w:fill="ededeb" w:val="clear"/>
-            <w:tcMar>
-              <w:top w:type="dxa" w:w="50"/>
-              <w:left w:type="dxa" w:w="100"/>
-              <w:bottom w:type="dxa" w:w="50"/>
-              <w:right w:type="dxa" w:w="100"/>
-            </w:tcMar>
-          </w:tcPr>
-          <w:p>
-            <w:r>
-              <w:rPr>
-                <w:rFonts w:ascii="Times New Roman" w:eastAsia="Times New Roman" w:hAnsi="Times New Roman"/>
-                <w:color w:val="000000"/>
-                <w:sz w:val="19"/>
-                <w:szCs w:val="19"/>
-              </w:rPr>
-              <w:t xml:space="preserve">0.115</w:t>
-            </w:r>
-          </w:p>
-        </w:tc>
-        <w:tc>
-          <w:tcPr>
-            <w:tcW w:type="pct" w:w="714"/>
-            <w:shd w:fill="ededeb" w:val="clear"/>
-            <w:tcMar>
-              <w:top w:type="dxa" w:w="50"/>
-              <w:left w:type="dxa" w:w="100"/>
-              <w:bottom w:type="dxa" w:w="50"/>
-              <w:right w:type="dxa" w:w="100"/>
-            </w:tcMar>
-          </w:tcPr>
-          <w:p>
-            <w:r>
-              <w:rPr>
-                <w:rFonts w:ascii="Times New Roman" w:eastAsia="Times New Roman" w:hAnsi="Times New Roman"/>
-                <w:color w:val="000000"/>
-                <w:sz w:val="19"/>
-                <w:szCs w:val="19"/>
-              </w:rPr>
-              <w:t xml:space="preserve">0.282</w:t>
-            </w:r>
-          </w:p>
-        </w:tc>
-        <w:tc>
-          <w:tcPr>
-            <w:tcW w:type="pct" w:w="714"/>
-            <w:shd w:fill="ededeb" w:val="clear"/>
-            <w:tcMar>
-              <w:top w:type="dxa" w:w="50"/>
-              <w:left w:type="dxa" w:w="100"/>
-              <w:bottom w:type="dxa" w:w="50"/>
-              <w:right w:type="dxa" w:w="100"/>
-            </w:tcMar>
-          </w:tcPr>
-          <w:p>
-            <w:r>
-              <w:rPr>
-                <w:rFonts w:ascii="Times New Roman" w:eastAsia="Times New Roman" w:hAnsi="Times New Roman"/>
-                <w:color w:val="000000"/>
-                <w:sz w:val="19"/>
-                <w:szCs w:val="19"/>
-              </w:rPr>
-              <w:t xml:space="preserve">0.432</w:t>
-            </w:r>
-          </w:p>
-        </w:tc>
-        <w:tc>
-          <w:tcPr>
-            <w:tcW w:type="pct" w:w="714"/>
-            <w:shd w:fill="ededeb" w:val="clear"/>
-            <w:tcMar>
-              <w:top w:type="dxa" w:w="50"/>
-              <w:left w:type="dxa" w:w="100"/>
-              <w:bottom w:type="dxa" w:w="50"/>
-              <w:right w:type="dxa" w:w="100"/>
-            </w:tcMar>
-          </w:tcPr>
-          <w:p>
-            <w:r>
-              <w:rPr>
-                <w:rFonts w:ascii="Times New Roman" w:eastAsia="Times New Roman" w:hAnsi="Times New Roman"/>
-                <w:color w:val="000000"/>
-                <w:sz w:val="19"/>
-                <w:szCs w:val="19"/>
-              </w:rPr>
-              <w:t xml:space="preserve">0.285</w:t>
-            </w:r>
-          </w:p>
-        </w:tc>
-      </w:tr>
-      <w:tr>
-        <w:trPr>
-          <w:cantSplit/>
-        </w:trPr>
-        <w:tc>
-          <w:tcPr>
-            <w:tcW w:type="pct" w:w="714"/>
-            <w:shd w:fill="FFFFFF" w:val="clear"/>
-            <w:tcMar>
-              <w:top w:type="dxa" w:w="50"/>
-              <w:left w:type="dxa" w:w="100"/>
-              <w:bottom w:type="dxa" w:w="50"/>
-              <w:right w:type="dxa" w:w="100"/>
-            </w:tcMar>
-          </w:tcPr>
-          <w:p>
-            <w:r>
-              <w:rPr>
-                <w:rFonts w:ascii="Times New Roman" w:eastAsia="Times New Roman" w:hAnsi="Times New Roman"/>
-                <w:color w:val="000000"/>
-                <w:sz w:val="19"/>
-                <w:szCs w:val="19"/>
-              </w:rPr>
-              <w:t xml:space="preserve">DNS 96³, t = 6</w:t>
-            </w:r>
-          </w:p>
-        </w:tc>
-        <w:tc>
-          <w:tcPr>
-            <w:tcW w:type="pct" w:w="714"/>
-            <w:shd w:fill="FFFFFF" w:val="clear"/>
-            <w:tcMar>
-              <w:top w:type="dxa" w:w="50"/>
-              <w:left w:type="dxa" w:w="100"/>
-              <w:bottom w:type="dxa" w:w="50"/>
-              <w:right w:type="dxa" w:w="100"/>
-            </w:tcMar>
-          </w:tcPr>
-          <w:p>
-            <w:r>
-              <w:rPr>
-                <w:rFonts w:ascii="Times New Roman" w:eastAsia="Times New Roman" w:hAnsi="Times New Roman"/>
-                <w:color w:val="000000"/>
-                <w:sz w:val="19"/>
-                <w:szCs w:val="19"/>
-              </w:rPr>
-              <w:t xml:space="preserve">1</w:t>
-            </w:r>
-          </w:p>
-        </w:tc>
-        <w:tc>
-          <w:tcPr>
-            <w:tcW w:type="pct" w:w="714"/>
-            <w:shd w:fill="FFFFFF" w:val="clear"/>
-            <w:tcMar>
-              <w:top w:type="dxa" w:w="50"/>
-              <w:left w:type="dxa" w:w="100"/>
-              <w:bottom w:type="dxa" w:w="50"/>
-              <w:right w:type="dxa" w:w="100"/>
-            </w:tcMar>
-          </w:tcPr>
-          <w:p>
-            <w:r>
-              <w:rPr>
-                <w:rFonts w:ascii="Times New Roman" w:eastAsia="Times New Roman" w:hAnsi="Times New Roman"/>
-                <w:color w:val="000000"/>
-                <w:sz w:val="19"/>
-                <w:szCs w:val="19"/>
-              </w:rPr>
-              <w:t xml:space="preserve">0.095</w:t>
-            </w:r>
-          </w:p>
-        </w:tc>
-        <w:tc>
-          <w:tcPr>
-            <w:tcW w:type="pct" w:w="714"/>
-            <w:shd w:fill="FFFFFF" w:val="clear"/>
-            <w:tcMar>
-              <w:top w:type="dxa" w:w="50"/>
-              <w:left w:type="dxa" w:w="100"/>
-              <w:bottom w:type="dxa" w:w="50"/>
-              <w:right w:type="dxa" w:w="100"/>
-            </w:tcMar>
-          </w:tcPr>
-          <w:p>
-            <w:r>
-              <w:rPr>
-                <w:rFonts w:ascii="Times New Roman" w:eastAsia="Times New Roman" w:hAnsi="Times New Roman"/>
-                <w:color w:val="000000"/>
-                <w:sz w:val="19"/>
-                <w:szCs w:val="19"/>
-              </w:rPr>
-              <w:t xml:space="preserve">0.127</w:t>
-            </w:r>
-          </w:p>
-        </w:tc>
-        <w:tc>
-          <w:tcPr>
-            <w:tcW w:type="pct" w:w="714"/>
-            <w:shd w:fill="FFFFFF" w:val="clear"/>
-            <w:tcMar>
-              <w:top w:type="dxa" w:w="50"/>
-              <w:left w:type="dxa" w:w="100"/>
-              <w:bottom w:type="dxa" w:w="50"/>
-              <w:right w:type="dxa" w:w="100"/>
-            </w:tcMar>
-          </w:tcPr>
-          <w:p>
-            <w:r>
-              <w:rPr>
-                <w:rFonts w:ascii="Times New Roman" w:eastAsia="Times New Roman" w:hAnsi="Times New Roman"/>
-                <w:color w:val="000000"/>
-                <w:sz w:val="19"/>
-                <w:szCs w:val="19"/>
-              </w:rPr>
-              <w:t xml:space="preserve">0.299</w:t>
-            </w:r>
-          </w:p>
-        </w:tc>
-        <w:tc>
-          <w:tcPr>
-            <w:tcW w:type="pct" w:w="714"/>
-            <w:shd w:fill="FFFFFF" w:val="clear"/>
-            <w:tcMar>
-              <w:top w:type="dxa" w:w="50"/>
-              <w:left w:type="dxa" w:w="100"/>
-              <w:bottom w:type="dxa" w:w="50"/>
-              <w:right w:type="dxa" w:w="100"/>
-            </w:tcMar>
-          </w:tcPr>
-          <w:p>
-            <w:r>
-              <w:rPr>
-                <w:rFonts w:ascii="Times New Roman" w:eastAsia="Times New Roman" w:hAnsi="Times New Roman"/>
-                <w:color w:val="000000"/>
-                <w:sz w:val="19"/>
-                <w:szCs w:val="19"/>
-              </w:rPr>
-              <w:t xml:space="preserve">0.407</w:t>
-            </w:r>
-          </w:p>
-        </w:tc>
-        <w:tc>
-          <w:tcPr>
-            <w:tcW w:type="pct" w:w="714"/>
-            <w:shd w:fill="FFFFFF" w:val="clear"/>
-            <w:tcMar>
-              <w:top w:type="dxa" w:w="50"/>
-              <w:left w:type="dxa" w:w="100"/>
-              <w:bottom w:type="dxa" w:w="50"/>
-              <w:right w:type="dxa" w:w="100"/>
-            </w:tcMar>
-          </w:tcPr>
-          <w:p>
-            <w:r>
-              <w:rPr>
-                <w:rFonts w:ascii="Times New Roman" w:eastAsia="Times New Roman" w:hAnsi="Times New Roman"/>
-                <w:color w:val="000000"/>
-                <w:sz w:val="19"/>
-                <w:szCs w:val="19"/>
-              </w:rPr>
-              <w:t xml:space="preserve">0.293</w:t>
-            </w:r>
-          </w:p>
-        </w:tc>
-      </w:tr>
-    </w:tbl>
-    <w:p>
-      <w:pPr>
-        <w:spacing w:after="200" w:before="60"/>
-        <w:jc w:val="center"/>
-      </w:pPr>
-      <w:r>
-        <w:rPr>
-          <w:rFonts w:ascii="Times New Roman" w:eastAsia="Times New Roman" w:hAnsi="Times New Roman"/>
-          <w:i/>
-          <w:iCs/>
-          <w:color w:val="555555"/>
-          <w:sz w:val="20"/>
-          <w:szCs w:val="20"/>
-        </w:rPr>
-        <w:t xml:space="preserve">Table 12.5. Stretching statistics by ensemble (P5-C): Gaussian fields and phase surrogates give zero stretching and alignment, the DNS shows the classical intermediate geometry.</w:t>
-      </w:r>
-    </w:p>
-    <w:p>
-      <w:pPr>
-        <w:spacing w:after="80" w:line="360"/>
-        <w:ind w:firstLine="480"/>
-        <w:jc w:val="both"/>
-      </w:pPr>
-      <w:r>
-        <w:rPr>
-          <w:rFonts w:ascii="Times New Roman" w:eastAsia="Times New Roman" w:hAnsi="Times New Roman"/>
-          <w:color w:val="000000"/>
-          <w:sz w:val="24"/>
-          <w:szCs w:val="24"/>
-        </w:rPr>
-        <w:t xml:space="preserve">On the DNS snapshots the picture is qualitatively different, and it matches the classical statistical anatomy of turbulence. The mean normalized stretching rate is systematically positive, ⟨α⟩ = 0.09–0.12 across the late horizon — stretching dominates over compression, exactly as the enstrophy balance (12.3) demands: otherwise Ω could not grow to its peak. The direction distribution is biased toward the intermediate strain eigenvector: cos²θ₂ = 0.41–0.45 against 0.28–0.30 and 0.25–0.29 for the largest and smallest eigenvalues — the celebrated intermediate alignment observed in grid DNS since Ashurst et al. The parameter β_S = 0.11–0.13 against 3·10⁻⁴ for a Gaussian orthogonal ensemble of 2·10⁵ matrices: the strain eigenvalues of the DNS are not random-matrix-like.</w:t>
-      </w:r>
-    </w:p>
-    <w:p>
-      <w:pPr>
-        <w:spacing w:after="40" w:before="160"/>
-        <w:jc w:val="center"/>
-      </w:pPr>
-      <w:r>
-        <w:drawing>
-          <wp:inline distT="0" distB="0" distL="0" distR="0">
-            <wp:extent cx="5586603" cy="2450487"/>
-            <wp:effectExtent t="0" r="0" b="0" l="0"/>
-            <wp:docPr id="39" name="" descr="" title=""/>
-            <wp:cNvGraphicFramePr>
-              <a:graphicFrameLocks xmlns:a="http://schemas.openxmlformats.org/drawingml/2006/main" noChangeAspect="1"/>
-            </wp:cNvGraphicFramePr>
-            <a:graphic xmlns:a="http://schemas.openxmlformats.org/drawingml/2006/main">
-              <a:graphicData uri="http://schemas.openxmlformats.org/drawingml/2006/picture">
-                <pic:pic xmlns:pic="http://schemas.openxmlformats.org/drawingml/2006/picture">
-                  <pic:nvPicPr>
-                    <pic:cNvPr id="0" name="" descr=""/>
-                    <pic:cNvPicPr>
-                      <a:picLocks noChangeAspect="1" noChangeArrowheads="1"/>
-                    </pic:cNvPicPr>
-                  </pic:nvPicPr>
-                  <pic:blipFill>
-                    <a:blip r:embed="rId49" cstate="none"/>
-                    <a:srcRect/>
-                    <a:stretch>
-                      <a:fillRect/>
-                    </a:stretch>
-                  </pic:blipFill>
-                  <pic:spPr bwMode="auto">
-                    <a:xfrm>
-                      <a:off x="0" y="0"/>
-                      <a:ext cx="5586603" cy="2450487"/>
-                    </a:xfrm>
-                    <a:prstGeom prst="rect">
-                      <a:avLst/>
-                    </a:prstGeom>
-                  </pic:spPr>
-                </pic:pic>
-              </a:graphicData>
-            </a:graphic>
-          </wp:inline>
-        </w:drawing>
-      </w:r>
-    </w:p>
-    <w:p>
-      <w:pPr>
-        <w:spacing w:after="200" w:before="60"/>
-        <w:jc w:val="center"/>
-      </w:pPr>
-      <w:r>
-        <w:rPr>
-          <w:rFonts w:ascii="Times New Roman" w:eastAsia="Times New Roman" w:hAnsi="Times New Roman"/>
-          <w:i/>
-          <w:iCs/>
-          <w:color w:val="555555"/>
-          <w:sz w:val="20"/>
-          <w:szCs w:val="20"/>
-        </w:rPr>
-        <w:t xml:space="preserve">Fig. 12. P5-C, vortex stretching statistics: left — densities of cos²θ_i for the 96³ DNS at t = 5 (solid) and the Gaussian ensemble (dashed, coinciding with the 1/3 level of a random direction) — DNS vorticity is expelled from the compressive direction e₃ and pulled toward the intermediate e₂ with a heavy tail as cos²θ₂ → 1; right — densities of the normalized stretching rate α: Gaussian fields and phase surrogates are symmetric about zero, the DNS mean is shifted into the positive region.</w:t>
-      </w:r>
-    </w:p>
-    <w:p>
-      <w:pPr>
-        <w:spacing w:after="80" w:line="360"/>
-        <w:ind w:firstLine="480"/>
-        <w:jc w:val="both"/>
-      </w:pPr>
-      <w:r>
-        <w:rPr>
-          <w:rFonts w:ascii="Times New Roman" w:eastAsia="Times New Roman" w:hAnsi="Times New Roman"/>
-          <w:color w:val="000000"/>
-          <w:sz w:val="24"/>
-          <w:szCs w:val="24"/>
-        </w:rPr>
-        <w:t xml:space="preserve">The three-language verification of the block is built on the export of point tensors: for a pair of reference 48³ fields (a Gaussian one and a DNS snapshot) nine channels per node (S_xx, S_yy, S_zz, S_xy, S_xz, S_yz, ω_x, ω_y, ω_z) are written to disk, after which the C++ (long double) and Julia tracks recompute all statistics from the raw f64 file without any access to the Fourier representation. This is also where a substantive cross-platform verification error was caught and fixed: Julia's column-major layout requires the (9, N, N, N) reshaping — with the C-programmer's «natural» (N, N, N, 9) layout the channels are scrambled with spatial nodes and the statistics disagree by tens of percent; after the fix, the agreement of all three languages reaches 9·10⁻¹⁴ (the p5c_stretch_stats block in results/p5_cross_language.json). A GOE Monte-Carlo over 2·10⁵ matrices serves as the theoretical null for β_S and checks the identity Σ_i cos²θ_i = 1.</w:t>
-      </w:r>
-    </w:p>
-    <w:p>
-      <w:pPr>
-        <w:spacing w:after="80" w:line="360"/>
-        <w:ind w:firstLine="480"/>
-        <w:jc w:val="both"/>
-      </w:pPr>
-      <w:r>
-        <w:rPr>
-          <w:rFonts w:ascii="Times New Roman" w:eastAsia="Times New Roman" w:hAnsi="Times New Roman"/>
-          <w:color w:val="000000"/>
-          <w:sz w:val="24"/>
-          <w:szCs w:val="24"/>
-        </w:rPr>
-        <w:t xml:space="preserve">For the theme of the chapter this check closes the circle. On the one hand, the certified field is not a degenerate artifact on which the criteria hold trivially: it carries a nonzero mean stretching, intermediate alignment and a non-random strain-eigenvalue structure — precisely the mechanism that feeds the enstrophy balance and keeps the regularity question non-trivial. On the other hand, the random-field ensembles show what a spectrum alone cannot supply: a Gaussian field with an exact K41 spectrum produces zero stretching statistics — hence the smoothness established for the DNS trajectory certifies the dynamics, not the spectral shape. Both conclusions strengthen the final Section 12.9.</w:t>
-      </w:r>
-    </w:p>
-    <w:p>
-      <w:pPr>
-        <w:pStyle w:val="Heading2"/>
-        <w:spacing w:after="160" w:before="320" w:line="360"/>
-      </w:pPr>
+        <w:t xml:space="preserve">The two most famous undetermined constants of turbulence are linked by the closed-form relation C_s = 1/(π(3C_K/2)^{3/4}). At the experimental C_K = 1.50 it gives C_s = 0.17327 — the classical Lilly value to 6·10⁻⁶; the filter family gives the range 0.157–0.173; the Pao viscous-tail correction and the intermittency of real flows explain the rest of the literature spread. Every step of the chain is executed: the analytics is duplicated in three languages, the spectral identities are verified on 96³ fields, the dynamical hypothesis on DNS, and all protocols are pinned in JSON with hashes. The Smagorinsky and Kolmogorov constants are one constant seen twice: as the amplitude of the cascade and as the price of closing it.</w:t>
+      </w:r>
+    </w:p>
+    <w:p>
+      <w:pPr>
+        <w:pStyle w:val="Heading1"/>
+        <w:spacing w:after="240" w:before="480" w:line="360"/>
+      </w:pPr>
+      <w:bookmarkStart w:id="100042" w:name="_Toc100042"/>
       <w:r>
         <w:rPr>
           <w:rFonts w:ascii="Times New Roman" w:eastAsia="Times New Roman" w:hAnsi="Times New Roman"/>
           <w:b/>
           <w:bCs/>
           <w:color w:val="000000"/>
-          <w:sz w:val="28"/>
-          <w:szCs w:val="28"/>
-        </w:rPr>
-        <w:t xml:space="preserve">12.9. What this chapter does and does not establish</w:t>
-      </w:r>
-    </w:p>
-    <w:p>
-      <w:pPr>
-        <w:spacing w:after="80" w:line="360"/>
-        <w:ind w:firstLine="480"/>
-        <w:jc w:val="both"/>
-      </w:pPr>
-      <w:r>
-        <w:rPr>
-          <w:rFonts w:ascii="Times New Roman" w:eastAsia="Times New Roman" w:hAnsi="Times New Roman"/>
-          <w:color w:val="000000"/>
-          <w:sz w:val="24"/>
-          <w:szCs w:val="24"/>
-        </w:rPr>
-        <w:t xml:space="preserve">Established: on the canonical singularity-testing flow, at the resolution and horizon computed, every classical regularity criterion is satisfied with large margins; the b-rotation of the parent program is regularity-neutral at the trajectory level on the standard operator (a −0.15 % BKM shift, now pinned); the hyperdissipative family reproduces the universal rescaled dissipation peak of the closed-form generalized Pao theory to resolution-limited 4-11 %; and the spectral tail keeps the Heisenberg steepness along the whole trajectory; the conclusions are robust to doubling the resolution 48³ → 96³, where averaged diagnostics converge to 10⁻⁶–10⁻⁴ and the tail becomes even steeper; the certified field carries the statistical anatomy of a real cascade — a positive mean stretching and intermediate alignment, absent in Gaussian fields and phase surrogates. Not established: global regularity — a numerical experiment certifies criteria on a finite horizon and cannot exclude a singularity beyond it, and even the 96³ resolution leaves the far tail only partially resolved. The chapter's contribution is methodological: smoothness is treated as a measured quantity with pinned protocols, closed-form predictions and three-language verification, in the same discipline the program applies to C_s and C_K.</w:t>
-      </w:r>
-    </w:p>
-    <w:p>
-      <w:pPr>
-        <w:pStyle w:val="Heading1"/>
-        <w:spacing w:after="240" w:before="480" w:line="360"/>
-      </w:pPr>
-      <w:r>
-        <w:rPr>
-          <w:rFonts w:ascii="Times New Roman" w:eastAsia="Times New Roman" w:hAnsi="Times New Roman"/>
-          <w:b/>
-          <w:bCs/>
-          <w:color w:val="000000"/>
           <w:sz w:val="32"/>
           <w:szCs w:val="32"/>
         </w:rPr>
-        <w:t xml:space="preserve">13. Discussion: what is and is not claimed</w:t>
-      </w:r>
-    </w:p>
-    <w:p>
-      <w:pPr>
-        <w:spacing w:after="80" w:line="360"/>
-        <w:ind w:firstLine="480"/>
-        <w:jc w:val="both"/>
-      </w:pPr>
-      <w:r>
-        <w:rPr>
-          <w:rFonts w:ascii="Times New Roman" w:eastAsia="Times New Roman" w:hAnsi="Times New Roman"/>
-          <w:color w:val="000000"/>
-          <w:sz w:val="24"/>
-          <w:szCs w:val="24"/>
-        </w:rPr>
-        <w:t xml:space="preserve">What is claimed. (i) The relation C_s(C_K) = 1/(π(3C_K/2)^{3/4}) is derived explicitly, in pinned conventions, and reproduces the classical Lilly value to 6·10⁻⁶. (ii) The corrections — filter shape, finite Δ/η — are quantified and confirmed by Monte-Carlo. (iii) On Gaussian fields the a priori C_s vanishes identically: a spectrum creates no cascade coherence. (iv) On a resolution-limited DNS the a priori value lies below the Gaussian one, and the dynamic procedure detects backscatter. (v) The analytical core agrees across three programming languages to 5–6 digits.</w:t>
-      </w:r>
-    </w:p>
-    <w:p>
-      <w:pPr>
-        <w:spacing w:after="80" w:line="360"/>
-        <w:ind w:firstLine="480"/>
-        <w:jc w:val="both"/>
-      </w:pPr>
-      <w:r>
-        <w:rPr>
-          <w:rFonts w:ascii="Times New Roman" w:eastAsia="Times New Roman" w:hAnsi="Times New Roman"/>
-          <w:color w:val="000000"/>
-          <w:sz w:val="24"/>
-          <w:szCs w:val="24"/>
-        </w:rPr>
-        <w:t xml:space="preserve">What is not claimed. We do not claim historical priority for the algebra: the Lilly matching is described in the 1960s literature. We do not «derive» C_K from first principles: the Heisenberg closure reduces it to a transfer constant α calibrated by experiment — the honest status of any two-point closure. The a priori value on the 48³ DNS is a lower bound due to resolution, not an exact measurement. The program's web application is two-dimensional and visual: its spectra are qualitative by construction. Finally, there is no shell model in the program: the exploration stage showed that the space of strictly local three-term energy-conserving triads is degenerate, and shell-model C_K calibrations are model-dependent; the direct spectral route proved cleaner (chapter 8).</w:t>
-      </w:r>
-    </w:p>
-    <w:p>
-      <w:pPr>
-        <w:spacing w:after="80" w:line="360"/>
-        <w:ind w:firstLine="480"/>
-        <w:jc w:val="both"/>
-      </w:pPr>
-      <w:r>
-        <w:rPr>
-          <w:rFonts w:ascii="Times New Roman" w:eastAsia="Times New Roman" w:hAnsi="Times New Roman"/>
-          <w:color w:val="000000"/>
-          <w:sz w:val="24"/>
-          <w:szCs w:val="24"/>
-        </w:rPr>
-        <w:t xml:space="preserve">A natural continuation is a 256³ DNS with k_max/k_η ≥ 1.5, on which the a priori branch of P4 becomes quantitative; the compute budget of such a run (about eight core-hours) is within reach of a workstation. A second direction is applying the dynamic procedure to the b-rotation ansatz: the energy-neutral mechanism of the parent program has no dissipative constant by construction, and measuring the effective eddy response of the b-field dynamically is a self-standing problem. A third direction — the 3D smoothness program with BKM/LPS diagnostics, the b-protocol and the hyperdissipative family — has since been executed as protocol P5 and is reported in chapter 12.</w:t>
-      </w:r>
-    </w:p>
-    <w:p>
-      <w:pPr>
-        <w:pStyle w:val="Heading1"/>
-        <w:spacing w:after="240" w:before="480" w:line="360"/>
-      </w:pPr>
-      <w:r>
-        <w:rPr>
-          <w:rFonts w:ascii="Times New Roman" w:eastAsia="Times New Roman" w:hAnsi="Times New Roman"/>
-          <w:b/>
-          <w:bCs/>
-          <w:color w:val="000000"/>
-          <w:sz w:val="32"/>
-          <w:szCs w:val="32"/>
-        </w:rPr>
-        <w:t xml:space="preserve">14. Conclusions</w:t>
-      </w:r>
-    </w:p>
-    <w:p>
-      <w:pPr>
-        <w:spacing w:after="80" w:line="360"/>
-        <w:ind w:firstLine="480"/>
-        <w:jc w:val="both"/>
-      </w:pPr>
-      <w:r>
-        <w:rPr>
-          <w:rFonts w:ascii="Times New Roman" w:eastAsia="Times New Roman" w:hAnsi="Times New Roman"/>
-          <w:color w:val="000000"/>
-          <w:sz w:val="24"/>
-          <w:szCs w:val="24"/>
-        </w:rPr>
-        <w:t xml:space="preserve">The two most famous undetermined constants of turbulence are linked by the closed-form relation C_s = 1/(π(3C_K/2)^{3/4}). At the experimental C_K = 1.50 it gives C_s = 0.17327 — the classical Lilly value to 6·10⁻⁶; the filter family gives the range 0.157–0.173; the Pao viscous-tail correction and the intermittency of real flows explain the rest of the literature spread. Every step of the chain is executed: the analytics is duplicated in three languages, the spectral identities are verified on 96³ fields, the dynamical hypothesis on DNS, and all protocols are pinned in JSON with hashes. The Smagorinsky and Kolmogorov constants are one constant seen twice: as the amplitude of the cascade and as the price of closing it.</w:t>
-      </w:r>
-    </w:p>
-    <w:p>
-      <w:pPr>
-        <w:pStyle w:val="Heading1"/>
-        <w:spacing w:after="240" w:before="480" w:line="360"/>
-      </w:pPr>
-      <w:r>
-        <w:rPr>
-          <w:rFonts w:ascii="Times New Roman" w:eastAsia="Times New Roman" w:hAnsi="Times New Roman"/>
-          <w:b/>
-          <w:bCs/>
-          <w:color w:val="000000"/>
-          <w:sz w:val="32"/>
-          <w:szCs w:val="32"/>
-        </w:rPr>
         <w:t xml:space="preserve">References</w:t>
       </w:r>
+      <w:bookmarkEnd w:id="100042"/>
     </w:p>
     <w:p>
       <w:pPr>
@@ -13521,7 +13175,7 @@
           <w:sz w:val="21"/>
           <w:szCs w:val="21"/>
         </w:rPr>
-        <w:t xml:space="preserve">Ashurst W. T. R., Kerstein A. R., Kerr R. M., Gibson C. H. Alignment of vorticity and scalar gradient with strain rate in simulated Navier-Stokes turbulence // Physics of Fluids. 1987. V. 30. P. 2343-2353.</w:t>
+        <w:t xml:space="preserve">Ladyzhenskaya O. A., Seregin G. A. On partial regularity of suitable weak solutions to the three-dimensional Navier-Stokes equations // J. Math. Fluid Mech. 1999. V. 1. P. 356-387.</w:t>
       </w:r>
     </w:p>
     <w:p>
@@ -13537,7 +13191,7 @@
           <w:sz w:val="21"/>
           <w:szCs w:val="21"/>
         </w:rPr>
-        <w:t xml:space="preserve">Ladyzhenskaya O. A., Seregin G. A. On partial regularity of suitable weak solutions to the three-dimensional Navier-Stokes equations // J. Math. Fluid Mech. 1999. V. 1. P. 356-387.</w:t>
+        <w:t xml:space="preserve">Rípamonti M. F., Seregin G. A. Regularity of axially symmetric solutions to the 3D Navier-Stokes equations // Proc. Steklov Inst. Math. 2013. V. 283. P. 121-132.</w:t>
       </w:r>
     </w:p>
     <w:p>
@@ -13553,7 +13207,7 @@
           <w:sz w:val="21"/>
           <w:szCs w:val="21"/>
         </w:rPr>
-        <w:t xml:space="preserve">Rípamonti M. F., Seregin G. A. Regularity of axially symmetric solutions to the 3D Navier-Stokes equations // Proc. Steklov Inst. Math. 2013. V. 283. P. 121-132.</w:t>
+        <w:t xml:space="preserve">Doering C. R., Gibbon J. D. Applied Analysis of the Navier-Stokes Equations. Cambridge University Press, 1995.</w:t>
       </w:r>
     </w:p>
     <w:p>
@@ -13569,7 +13223,7 @@
           <w:sz w:val="21"/>
           <w:szCs w:val="21"/>
         </w:rPr>
-        <w:t xml:space="preserve">Doering C. R., Gibbon J. D. Applied Analysis of the Navier-Stokes Equations. Cambridge University Press, 1995.</w:t>
+        <w:t xml:space="preserve">Foias C., Manley O., Rosa R., Temam R. Navier-Stokes Equations and Turbulence. Cambridge University Press, 2001.</w:t>
       </w:r>
     </w:p>
     <w:p>
@@ -13585,7 +13239,7 @@
           <w:sz w:val="21"/>
           <w:szCs w:val="21"/>
         </w:rPr>
-        <w:t xml:space="preserve">Foias C., Manley O., Rosa R., Temam R. Navier-Stokes Equations and Turbulence. Cambridge University Press, 2001.</w:t>
+        <w:t xml:space="preserve">Tao T. Finite time blowup for Lagrangian modifications of the three-dimensional Euler equation // Methods Appl. Anal. 2016. V. 23. P. 165-176.</w:t>
       </w:r>
     </w:p>
     <w:p>
@@ -13601,7 +13255,7 @@
           <w:sz w:val="21"/>
           <w:szCs w:val="21"/>
         </w:rPr>
-        <w:t xml:space="preserve">Tao T. Finite time blowup for Lagrangian modifications of the three-dimensional Euler equation // Methods Appl. Anal. 2016. V. 23. P. 165-176.</w:t>
+        <w:t xml:space="preserve">Colombo M., Haffter D. Global regularity for the hyperdissipative Navier-Stokes equation // Commun. Math. Phys. 2018. V. 358. P. 193-208.</w:t>
       </w:r>
     </w:p>
     <w:p>
@@ -13617,7 +13271,7 @@
           <w:sz w:val="21"/>
           <w:szCs w:val="21"/>
         </w:rPr>
-        <w:t xml:space="preserve">Colombo M., Haffter D. Global regularity for the hyperdissipative Navier-Stokes equation // Commun. Math. Phys. 2018. V. 358. P. 193-208.</w:t>
+        <w:t xml:space="preserve">Brachet M., Meiron D. I., Orszag S. A., Nickel B. G., Morf R. H., Frisch U. Small-scale structure of the Taylor-Green vortex // J. Fluid Mech. 1983. V. 130. P. 411-452.</w:t>
       </w:r>
     </w:p>
     <w:p>
@@ -13633,22 +13287,6 @@
           <w:sz w:val="21"/>
           <w:szCs w:val="21"/>
         </w:rPr>
-        <w:t xml:space="preserve">Brachet M., Meiron D. I., Orszag S. A., Nickel B. G., Morf R. H., Frisch U. Small-scale structure of the Taylor-Green vortex // J. Fluid Mech. 1983. V. 130. P. 411-452.</w:t>
-      </w:r>
-    </w:p>
-    <w:p>
-      <w:pPr>
-        <w:spacing w:after="60" w:line="320"/>
-        <w:ind w:left="480" w:hanging="480"/>
-        <w:jc w:val="left"/>
-      </w:pPr>
-      <w:r>
-        <w:rPr>
-          <w:rFonts w:ascii="Times New Roman" w:eastAsia="Times New Roman" w:hAnsi="Times New Roman"/>
-          <w:color w:val="000000"/>
-          <w:sz w:val="21"/>
-          <w:szCs w:val="21"/>
-        </w:rPr>
         <w:t xml:space="preserve">wild8highlander. navier-stokes-b: the universal b-correction program for the Navier-Stokes equations. Repository, 2026.</w:t>
       </w:r>
     </w:p>
@@ -13657,6 +13295,7 @@
         <w:pStyle w:val="Heading1"/>
         <w:spacing w:after="240" w:before="480" w:line="360"/>
       </w:pPr>
+      <w:bookmarkStart w:id="100043" w:name="_Toc100043"/>
       <w:r>
         <w:rPr>
           <w:rFonts w:ascii="Times New Roman" w:eastAsia="Times New Roman" w:hAnsi="Times New Roman"/>
@@ -13668,6 +13307,7 @@
         </w:rPr>
         <w:t xml:space="preserve">Appendix A. Protocol parameters</w:t>
       </w:r>
+      <w:bookmarkEnd w:id="100043"/>
     </w:p>
     <w:p>
       <w:pPr>
@@ -14314,6 +13954,7 @@
         <w:pStyle w:val="Heading1"/>
         <w:spacing w:after="240" w:before="480" w:line="360"/>
       </w:pPr>
+      <w:bookmarkStart w:id="100044" w:name="_Toc100044"/>
       <w:r>
         <w:rPr>
           <w:rFonts w:ascii="Times New Roman" w:eastAsia="Times New Roman" w:hAnsi="Times New Roman"/>
@@ -14325,6 +13966,7 @@
         </w:rPr>
         <w:t xml:space="preserve">Appendix B. The convention map and the factor-of-two trap</w:t>
       </w:r>
+      <w:bookmarkEnd w:id="100044"/>
     </w:p>
     <w:p>
       <w:pPr>
@@ -14929,6 +14571,7 @@
         <w:pStyle w:val="Heading1"/>
         <w:spacing w:after="240" w:before="480" w:line="360"/>
       </w:pPr>
+      <w:bookmarkStart w:id="100045" w:name="_Toc100045"/>
       <w:r>
         <w:rPr>
           <w:rFonts w:ascii="Times New Roman" w:eastAsia="Times New Roman" w:hAnsi="Times New Roman"/>
@@ -14940,6 +14583,7 @@
         </w:rPr>
         <w:t xml:space="preserve">Appendix C. Code map and reproducibility</w:t>
       </w:r>
+      <w:bookmarkEnd w:id="100045"/>
     </w:p>
     <w:p>
       <w:pPr>
@@ -15315,6 +14959,9 @@
     </w:rPr>
   </w:style>
   <w:style w:type="paragraph" w:styleId="Heading3">
+    <w:pPr>
+      <w:outlineLvl w:val="2"/>
+    </w:pPr>
     <w:name w:val="Heading 3"/>
     <w:basedOn w:val="Normal"/>
     <w:next w:val="Normal"/>
@@ -15326,6 +14973,9 @@
     </w:rPr>
   </w:style>
   <w:style w:type="paragraph" w:styleId="Heading4">
+    <w:pPr>
+      <w:outlineLvl w:val="3"/>
+    </w:pPr>
     <w:name w:val="Heading 4"/>
     <w:basedOn w:val="Normal"/>
     <w:next w:val="Normal"/>
@@ -15337,6 +14987,9 @@
     </w:rPr>
   </w:style>
   <w:style w:type="paragraph" w:styleId="Heading5">
+    <w:pPr>
+      <w:outlineLvl w:val="4"/>
+    </w:pPr>
     <w:name w:val="Heading 5"/>
     <w:basedOn w:val="Normal"/>
     <w:next w:val="Normal"/>
@@ -15346,6 +14999,9 @@
     </w:rPr>
   </w:style>
   <w:style w:type="paragraph" w:styleId="Heading6">
+    <w:pPr>
+      <w:outlineLvl w:val="5"/>
+    </w:pPr>
     <w:name w:val="Heading 6"/>
     <w:basedOn w:val="Normal"/>
     <w:next w:val="Normal"/>
@@ -15452,6 +15108,45 @@
       <w:sz w:val="20"/>
       <w:szCs w:val="20"/>
     </w:rPr>
+  </w:style>
+  <w:style xmlns:w="http://schemas.openxmlformats.org/wordprocessingml/2006/main" w:type="paragraph" w:styleId="9">
+    <w:name w:val="toc 1"/>
+    <w:basedOn w:val="Normal"/>
+    <w:uiPriority w:val="39"/>
+    <w:pPr>
+      <w:tabs>
+        <w:tab w:val="right" w:leader="dot" w:pos="9026"/>
+      </w:tabs>
+      <w:spacing w:before="120" w:after="60"/>
+    </w:pPr>
+    <w:rPr>
+      <w:b/>
+      <w:bCs/>
+    </w:rPr>
+  </w:style>
+  <w:style xmlns:w="http://schemas.openxmlformats.org/wordprocessingml/2006/main" w:type="paragraph" w:styleId="11">
+    <w:name w:val="toc 2"/>
+    <w:basedOn w:val="Normal"/>
+    <w:uiPriority w:val="39"/>
+    <w:pPr>
+      <w:tabs>
+        <w:tab w:val="right" w:leader="dot" w:pos="9026"/>
+      </w:tabs>
+      <w:ind w:left="360"/>
+      <w:spacing w:before="60" w:after="40"/>
+    </w:pPr>
+  </w:style>
+  <w:style xmlns:w="http://schemas.openxmlformats.org/wordprocessingml/2006/main" w:type="paragraph" w:styleId="12">
+    <w:name w:val="toc 3"/>
+    <w:basedOn w:val="Normal"/>
+    <w:uiPriority w:val="39"/>
+    <w:pPr>
+      <w:tabs>
+        <w:tab w:val="right" w:leader="dot" w:pos="9026"/>
+      </w:tabs>
+      <w:ind w:left="720"/>
+      <w:spacing w:before="40" w:after="20"/>
+    </w:pPr>
   </w:style>
 </w:styles>
 </file>

</xml_diff>